<commit_message>
some image storyboard shibar
</commit_message>
<xml_diff>
--- a/output/documents/Pyx_Tracker_Capstone_SQL_ERD.docx
+++ b/output/documents/Pyx_Tracker_Capstone_SQL_ERD.docx
@@ -35,7 +35,7 @@
           <w:noProof/>
         </w:rPr>
         <w:drawing>
-          <wp:inline distT="0" distB="0" distL="0" distR="0" wp14:anchorId="7186F04A" wp14:editId="60BD3759">
+          <wp:inline distT="0" distB="0" distL="0" distR="0" wp14:anchorId="1D843F21" wp14:editId="75769B6B">
             <wp:extent cx="1188720" cy="1108973"/>
             <wp:effectExtent l="0" t="0" r="0" b="0"/>
             <wp:docPr id="1" name="Picture 1"/>
@@ -237,7 +237,7 @@
         <w:fldChar w:fldCharType="begin"/>
       </w:r>
       <w:r>
-        <w:instrText>TOC \o "1-3" \h \z \u</w:instrText>
+        <w:instrText>TOC \h \z \u \t "CapH1,1,CapH2,2,CapH3,3"</w:instrText>
       </w:r>
       <w:r>
         <w:fldChar w:fldCharType="separate"/>
@@ -2156,66 +2156,6 @@
     </w:p>
     <w:p>
       <w:pPr>
-        <w:pStyle w:val="TOC3"/>
-        <w:spacing w:after="40" w:line="240" w:lineRule="auto"/>
-        <w:rPr>
-          <w:rFonts w:asciiTheme="minorHAnsi" w:eastAsiaTheme="minorEastAsia" w:hAnsiTheme="minorHAnsi" w:cstheme="minorBidi"/>
-          <w:color w:val="auto"/>
-          <w:lang w:val="en-PH" w:eastAsia="en-PH"/>
-        </w:rPr>
-      </w:pPr>
-      <w:hyperlink w:anchor="_Toc240538993" w:history="1">
-        <w:r>
-          <w:rPr>
-            <w:rStyle w:val="Hyperlink"/>
-          </w:rPr>
-          <w:t>Build 5 Return-to-Sender Management</w:t>
-        </w:r>
-        <w:r>
-          <w:rPr>
-            <w:webHidden/>
-          </w:rPr>
-          <w:tab/>
-        </w:r>
-        <w:r>
-          <w:rPr>
-            <w:webHidden/>
-          </w:rPr>
-          <w:fldChar w:fldCharType="begin"/>
-        </w:r>
-        <w:r>
-          <w:rPr>
-            <w:webHidden/>
-          </w:rPr>
-          <w:instrText xml:space="preserve"> PAGEREF _Toc240538993 \h </w:instrText>
-        </w:r>
-        <w:r>
-          <w:rPr>
-            <w:webHidden/>
-          </w:rPr>
-        </w:r>
-        <w:r>
-          <w:rPr>
-            <w:webHidden/>
-          </w:rPr>
-          <w:fldChar w:fldCharType="separate"/>
-        </w:r>
-        <w:r>
-          <w:rPr>
-            <w:webHidden/>
-          </w:rPr>
-          <w:t>27</w:t>
-        </w:r>
-        <w:r>
-          <w:rPr>
-            <w:webHidden/>
-          </w:rPr>
-          <w:fldChar w:fldCharType="end"/>
-        </w:r>
-      </w:hyperlink>
-    </w:p>
-    <w:p>
-      <w:pPr>
         <w:pStyle w:val="TOC2"/>
         <w:tabs>
           <w:tab w:val="right" w:leader="dot" w:pos="8630"/>
@@ -3484,7 +3424,7 @@
     </w:p>
     <w:p>
       <w:pPr>
-        <w:pStyle w:val="Heading1"/>
+        <w:pStyle w:val="CapHeading1"/>
         <w:pageBreakBefore/>
         <w:jc w:val="center"/>
       </w:pPr>
@@ -3510,7 +3450,7 @@
     </w:p>
     <w:p>
       <w:pPr>
-        <w:pStyle w:val="Heading2"/>
+        <w:pStyle w:val="CapHeading2"/>
       </w:pPr>
       <w:bookmarkStart w:id="1" w:name="_Toc240538968"/>
       <w:r>
@@ -3592,7 +3532,7 @@
     </w:p>
     <w:p>
       <w:pPr>
-        <w:pStyle w:val="Heading2"/>
+        <w:pStyle w:val="CapHeading2"/>
       </w:pPr>
       <w:bookmarkStart w:id="2" w:name="_Toc240538969"/>
       <w:r>
@@ -3602,7 +3542,7 @@
     </w:p>
     <w:p>
       <w:pPr>
-        <w:pStyle w:val="Heading3"/>
+        <w:pStyle w:val="CapHeading3"/>
       </w:pPr>
       <w:bookmarkStart w:id="3" w:name="_Toc240538970"/>
       <w:r>
@@ -3620,7 +3560,7 @@
     </w:p>
     <w:p>
       <w:pPr>
-        <w:pStyle w:val="Heading3"/>
+        <w:pStyle w:val="CapHeading3"/>
       </w:pPr>
       <w:bookmarkStart w:id="4" w:name="_Toc240538971"/>
       <w:r>
@@ -3674,22 +3614,31 @@
         <w:jc w:val="both"/>
       </w:pPr>
       <w:r>
-        <w:t>The module-specific tests in Chapter III evaluate these objectives through observable balances, cost calculations, generated documents, transaction records, and confirmed stock changes.</w:t>
+        <w:t>6. Implement a Point of Sale module that records walk-in sales through the web POS and the Android Mobile POS application, deducts inventory in real time, prints or stores receipts, and maintains sales history including reprint and refund paths.</w:t>
       </w:r>
     </w:p>
     <w:p>
       <w:pPr>
-        <w:pStyle w:val="Heading2"/>
+        <w:jc w:val="both"/>
+      </w:pPr>
+      <w:r>
+        <w:t>The module-specific tests in Chapter III evaluate these objectives through observable balances, cost calculations, generated documents, transaction records, confirmed stock changes, and POS sale or refund outcomes.</w:t>
+      </w:r>
+    </w:p>
+    <w:p>
+      <w:pPr>
+        <w:pStyle w:val="CapHeading2"/>
       </w:pPr>
       <w:bookmarkStart w:id="5" w:name="_Toc240538972"/>
       <w:r>
+        <w:lastRenderedPageBreak/>
         <w:t>Scope and Limitation of the Study</w:t>
       </w:r>
       <w:bookmarkEnd w:id="5"/>
     </w:p>
     <w:p>
       <w:pPr>
-        <w:pStyle w:val="Heading3"/>
+        <w:pStyle w:val="CapHeading3"/>
       </w:pPr>
       <w:bookmarkStart w:id="6" w:name="_Toc240538973"/>
       <w:r>
@@ -3702,11 +3651,7 @@
         <w:jc w:val="both"/>
       </w:pPr>
       <w:r>
-        <w:t xml:space="preserve">The study covers a role-based web application for the internal operations of Pyx Food Products. Its two user categories are Admin/Executive and Staff. </w:t>
-      </w:r>
-      <w:r>
-        <w:lastRenderedPageBreak/>
-        <w:t>Admin/Executive oversees the five features and exclusively maintains costing and pricing. Staff performs assigned inventory, order-processing, parcel-processing, and return tasks. Customers benefit from the resulting processes but are not authenticated users of a public storefront. The five major modules are as follows.</w:t>
+        <w:t>The study covers a role-based web application for the internal operations of Pyx Food Products, together with a companion Android Mobile POS terminal for walk-in sales. Its primary user categories are Admin/Executive and Staff. Admin/Executive oversees the six features and exclusively maintains costing and pricing. Staff performs assigned inventory, order-processing, parcel-processing, Point of Sale (web or Mobile POS), and return operations according to role permissions. Customers are indirect beneficiaries of completed sales and fulfilled orders.</w:t>
       </w:r>
     </w:p>
     <w:p>
@@ -3738,7 +3683,16 @@
         <w:ind w:left="317" w:hanging="317"/>
       </w:pPr>
       <w:r>
+        <w:lastRenderedPageBreak/>
         <w:t>- Parcel Processing and Inventory Synchronization — maintains packing and parcel records with applicable stock movements and separate shipment-photo documentation.</w:t>
+      </w:r>
+    </w:p>
+    <w:p>
+      <w:pPr>
+        <w:ind w:left="317" w:hanging="317"/>
+      </w:pPr>
+      <w:r>
+        <w:t>- Point of Sale System — digitizes walk-in sales through the web POS and the companion Android Mobile POS application (Pyx POS), including staff authentication, barcode sell checkout, accounts-receivable credit, sales history with reprint and full-sale refund, and ESC/POS thermal receipt printing over Bluetooth, USB, or Wi-Fi (port 9100). Sales synchronize to the same Pyx Tracker / RTS inventory and receipt records.</w:t>
       </w:r>
     </w:p>
     <w:p>
@@ -3754,16 +3708,15 @@
         <w:jc w:val="both"/>
       </w:pPr>
       <w:r>
-        <w:t>Authentication and permissions support these five features. Supporting records are documented only where they are needed for an included feature. The same module names are used in Chapter III.</w:t>
+        <w:t>Authentication and permissions support these six features, including web login and Mobile POS staff authentication against the RTS API. Supporting records are documented only where they are needed for an included feature. The same module names are used in Chapter III.</w:t>
       </w:r>
     </w:p>
     <w:p>
       <w:pPr>
-        <w:pStyle w:val="Heading3"/>
+        <w:pStyle w:val="CapHeading3"/>
       </w:pPr>
       <w:bookmarkStart w:id="7" w:name="_Toc240538974"/>
       <w:r>
-        <w:lastRenderedPageBreak/>
         <w:t>Limitation of the Study</w:t>
       </w:r>
       <w:bookmarkEnd w:id="7"/>
@@ -3773,7 +3726,11 @@
         <w:jc w:val="both"/>
       </w:pPr>
       <w:r>
-        <w:t>The project is limited to the identified company's workflows and configured product catalogs. It is not a multi-tenant commercial service or a public shopping platform. File preparation and waybill processing support implemented formats; universal marketplace compatibility and continuous API synchronization with Shopee, Facebook, or couriers are not claimed.</w:t>
+        <w:t xml:space="preserve">The project is limited to the identified company's workflows and configured product catalogs. It is not a multi-tenant commercial service or a public shopping platform. File preparation and waybill processing support implemented formats; </w:t>
+      </w:r>
+      <w:r>
+        <w:lastRenderedPageBreak/>
+        <w:t>universal marketplace compatibility and continuous API synchronization with Shopee, Facebook, or couriers are not claimed.</w:t>
       </w:r>
     </w:p>
     <w:p>
@@ -3781,7 +3738,7 @@
         <w:jc w:val="both"/>
       </w:pPr>
       <w:r>
-        <w:t>Users need access to the application server through a working network and compatible browser. Scanning depends on readable codes and suitable hardware or a supported camera environment. Reliable records require correct starting balances, mappings, units, prices, and confirmation of physical movements. A saved photo is documentary evidence and does not establish that the correct items were packed or delivered.</w:t>
+        <w:t>Users need access to the application server through a working network and a compatible browser for the web application. The Mobile POS application targets Android devices and requires network reachability to the RTS API endpoint, assigned Mobile POS staff access, and a configured thermal printer (Bluetooth, USB, or Wi-Fi port 9100) for on-device receipt printing. Scanning depends on readable barcodes and suitable camera or scanner hardware. Reliable records require correct starting balances, mappings, units, prices, and confirmation of physical movements when stock is affected.</w:t>
       </w:r>
     </w:p>
     <w:p>
@@ -3797,13 +3754,16 @@
         <w:jc w:val="both"/>
       </w:pPr>
       <w:r>
+        <w:t xml:space="preserve">The costing module depends on maintained formulas and prices. It is not a complete general ledger, payroll system, statutory accounting package, or autonomous pricing authority. The reviewed implementation does not substantiate </w:t>
+      </w:r>
+      <w:r>
         <w:lastRenderedPageBreak/>
-        <w:t>The costing module depends on maintained formulas and prices. It is not a complete general ledger, payroll system, statutory accounting package, or autonomous pricing authority. The reviewed implementation does not substantiate predictive forecasting, a generative AI assistant, or an AI pricing engine. Completed usability scores, performance benchmarks, and quantified business improvement require separate evaluation evidence.</w:t>
+        <w:t>predictive forecasting, a generative AI assistant, or an AI pricing engine. Completed usability scores, performance benchmarks, and quantified business improvement require separate evaluation evidence.</w:t>
       </w:r>
     </w:p>
     <w:p>
       <w:pPr>
-        <w:pStyle w:val="Heading2"/>
+        <w:pStyle w:val="CapHeading2"/>
       </w:pPr>
       <w:bookmarkStart w:id="8" w:name="_Toc240538975"/>
       <w:r>
@@ -3824,7 +3784,7 @@
         <w:jc w:val="both"/>
       </w:pPr>
       <w:r>
-        <w:t>For Staff, the five-feature workflow provides a consistent place to record material receipts, production, packing, order preparation, shipment evidence, and returns. The expected benefit is less duplicate encoding and clearer responsibility for recorded operations.</w:t>
+        <w:t>For Staff, the six-feature workflow provides a consistent place to record material receipts, production, packing, order preparation, shipment evidence, walk-in POS sales, and returns. The expected benefit is less duplicate encoding and clearer responsibility for recorded operations.</w:t>
       </w:r>
     </w:p>
     <w:p>
@@ -3840,19 +3800,16 @@
         <w:jc w:val="both"/>
       </w:pPr>
       <w:r>
-        <w:t xml:space="preserve">For future researchers, the project provides a Philippine food-enterprise case combining manufacturing-related inventory, online fulfillment, and reverse </w:t>
-      </w:r>
-      <w:r>
-        <w:lastRenderedPageBreak/>
-        <w:t>flows. Its contribution can be evaluated through transaction traceability and documented implementation limits.</w:t>
+        <w:t>For future researchers, the project provides a Philippine food-enterprise case combining manufacturing-related inventory, online fulfillment, and reverse flows. Its contribution can be evaluated through transaction traceability and documented implementation limits.</w:t>
       </w:r>
     </w:p>
     <w:p>
       <w:pPr>
-        <w:pStyle w:val="Heading2"/>
+        <w:pStyle w:val="CapHeading2"/>
       </w:pPr>
       <w:bookmarkStart w:id="9" w:name="_Toc240538976"/>
       <w:r>
+        <w:lastRenderedPageBreak/>
         <w:t>IPO Model</w:t>
       </w:r>
       <w:bookmarkEnd w:id="9"/>
@@ -3869,7 +3826,7 @@
           <w:noProof/>
         </w:rPr>
         <w:drawing>
-          <wp:inline distT="0" distB="0" distL="0" distR="0" wp14:anchorId="560143E5" wp14:editId="09969DFB">
+          <wp:inline distT="0" distB="0" distL="0" distR="0" wp14:anchorId="62354E2E" wp14:editId="320533B9">
             <wp:extent cx="5486400" cy="3657600"/>
             <wp:effectExtent l="0" t="0" r="0" b="0"/>
             <wp:docPr id="2" name="Picture 2"/>
@@ -3945,13 +3902,16 @@
         <w:jc w:val="both"/>
       </w:pPr>
       <w:r>
+        <w:t xml:space="preserve">The model separates documentation from inventory posting. A tracking number and photo produce a shipment record through a save action; a scanned </w:t>
+      </w:r>
+      <w:r>
         <w:lastRenderedPageBreak/>
-        <w:t>The model separates documentation from inventory posting. A tracking number and photo produce a shipment record through a save action; a scanned sellable return produces an inventory increase after confirmation. Each output is therefore tied to the action that creates it.</w:t>
+        <w:t>sellable return produces an inventory increase after confirmation. Each output is therefore tied to the action that creates it.</w:t>
       </w:r>
     </w:p>
     <w:p>
       <w:pPr>
-        <w:pStyle w:val="Heading2"/>
+        <w:pStyle w:val="CapHeading2"/>
       </w:pPr>
       <w:bookmarkStart w:id="10" w:name="_Toc240538977"/>
       <w:r>
@@ -4042,6 +4002,14 @@
         <w:jc w:val="both"/>
       </w:pPr>
       <w:r>
+        <w:t>ESC/POS — The command dialect used by the Mobile POS thermal printer path for Bluetooth, USB, or network (port 9100) receipt printing without watermark overlays.</w:t>
+      </w:r>
+    </w:p>
+    <w:p>
+      <w:pPr>
+        <w:jc w:val="both"/>
+      </w:pPr>
+      <w:r>
         <w:rPr>
           <w:b/>
         </w:rPr>
@@ -4099,6 +4067,14 @@
         <w:jc w:val="both"/>
       </w:pPr>
       <w:r>
+        <w:t>Mobile POS — The Android companion application (Pyx POS) that authenticates assigned staff against Pyx Tracker / RTS, records walk-in sales and accounts-receivable credits, prints ESC/POS thermal receipts, and synchronizes sale, reprint, and refund actions to the shared server records.</w:t>
+      </w:r>
+    </w:p>
+    <w:p>
+      <w:pPr>
+        <w:jc w:val="both"/>
+      </w:pPr>
+      <w:r>
         <w:rPr>
           <w:b/>
         </w:rPr>
@@ -4127,6 +4103,14 @@
         <w:jc w:val="both"/>
       </w:pPr>
       <w:r>
+        <w:t>Point of Sale — The walk-in sales capability of Pyx Tracker, delivered through the web POS interface and the Mobile POS application, including authentication, checkout, inventory deduction, receipts, and sales history.</w:t>
+      </w:r>
+    </w:p>
+    <w:p>
+      <w:pPr>
+        <w:jc w:val="both"/>
+      </w:pPr>
+      <w:r>
         <w:rPr>
           <w:b/>
         </w:rPr>
@@ -4144,6 +4128,7 @@
         <w:rPr>
           <w:b/>
         </w:rPr>
+        <w:lastRenderedPageBreak/>
         <w:t>Role-based access</w:t>
       </w:r>
       <w:r>
@@ -4186,7 +4171,6 @@
         <w:rPr>
           <w:b/>
         </w:rPr>
-        <w:lastRenderedPageBreak/>
         <w:t>Waybill</w:t>
       </w:r>
       <w:r>
@@ -4195,7 +4179,7 @@
     </w:p>
     <w:p>
       <w:pPr>
-        <w:pStyle w:val="Heading1"/>
+        <w:pStyle w:val="CapHeading1"/>
         <w:pageBreakBefore/>
         <w:jc w:val="center"/>
       </w:pPr>
@@ -4229,7 +4213,7 @@
     </w:p>
     <w:p>
       <w:pPr>
-        <w:pStyle w:val="Heading2"/>
+        <w:pStyle w:val="CapHeading2"/>
       </w:pPr>
       <w:bookmarkStart w:id="12" w:name="_Toc240538979"/>
       <w:r>
@@ -4282,7 +4266,7 @@
     </w:p>
     <w:p>
       <w:pPr>
-        <w:pStyle w:val="Heading2"/>
+        <w:pStyle w:val="CapHeading2"/>
       </w:pPr>
       <w:bookmarkStart w:id="13" w:name="_Toc240538980"/>
       <w:r>
@@ -4346,7 +4330,7 @@
     </w:p>
     <w:p>
       <w:pPr>
-        <w:pStyle w:val="Heading2"/>
+        <w:pStyle w:val="CapHeading2"/>
       </w:pPr>
       <w:bookmarkStart w:id="14" w:name="_Toc240538981"/>
       <w:r>
@@ -4397,7 +4381,7 @@
     </w:p>
     <w:p>
       <w:pPr>
-        <w:pStyle w:val="Heading2"/>
+        <w:pStyle w:val="CapHeading2"/>
       </w:pPr>
       <w:bookmarkStart w:id="15" w:name="_Toc240538982"/>
       <w:r>
@@ -4456,7 +4440,7 @@
     </w:p>
     <w:p>
       <w:pPr>
-        <w:pStyle w:val="Heading2"/>
+        <w:pStyle w:val="CapHeading2"/>
       </w:pPr>
       <w:bookmarkStart w:id="16" w:name="_Toc240538983"/>
       <w:r>
@@ -4520,7 +4504,7 @@
     </w:p>
     <w:p>
       <w:pPr>
-        <w:pStyle w:val="Heading2"/>
+        <w:pStyle w:val="CapHeading2"/>
       </w:pPr>
       <w:bookmarkStart w:id="17" w:name="_Toc240538984"/>
       <w:r>
@@ -4558,7 +4542,7 @@
     </w:p>
     <w:p>
       <w:pPr>
-        <w:pStyle w:val="Heading2"/>
+        <w:pStyle w:val="CapHeading2"/>
       </w:pPr>
       <w:bookmarkStart w:id="18" w:name="_Toc240538985"/>
       <w:r>
@@ -4596,7 +4580,7 @@
     </w:p>
     <w:p>
       <w:pPr>
-        <w:pStyle w:val="Heading1"/>
+        <w:pStyle w:val="CapHeading1"/>
         <w:pageBreakBefore/>
         <w:jc w:val="center"/>
       </w:pPr>
@@ -4630,7 +4614,7 @@
     </w:p>
     <w:p>
       <w:pPr>
-        <w:pStyle w:val="Heading2"/>
+        <w:pStyle w:val="CapHeading2"/>
       </w:pPr>
       <w:bookmarkStart w:id="20" w:name="_Toc240538987"/>
       <w:r>
@@ -4684,7 +4668,7 @@
     </w:p>
     <w:p>
       <w:pPr>
-        <w:pStyle w:val="Heading2"/>
+        <w:pStyle w:val="CapHeading2"/>
       </w:pPr>
       <w:bookmarkStart w:id="21" w:name="_Toc240538988"/>
       <w:r>
@@ -4697,7 +4681,7 @@
         <w:jc w:val="both"/>
       </w:pPr>
       <w:r>
-        <w:t>The study uses the Agile Software Development Model identified in the proposal. Agile principles emphasize working software, collaboration, responsiveness to requirements, and regular reflection (Beck et al., 2001). The methodology organizes work into five increments, each covering design and development, testing, and implementation or refinement. Shared authentication and data definitions support every increment.</w:t>
+        <w:t>The study uses the Agile Software Development Model identified in the proposal. Agile principles emphasize working software, collaboration, responsiveness to requirements, and regular reflection. Development is organized into six increments. Each build covers design and development, testing, and implementation or refinement. Shared authentication and data definitions support every increment, including the Point of Sale build for web POS and the Android Mobile POS application.</w:t>
       </w:r>
     </w:p>
     <w:p>
@@ -4712,8 +4696,8 @@
           <w:noProof/>
         </w:rPr>
         <w:drawing>
-          <wp:inline distT="0" distB="0" distL="0" distR="0" wp14:anchorId="72376E56" wp14:editId="5390D65F">
-            <wp:extent cx="5486400" cy="3108960"/>
+          <wp:inline distT="0" distB="0" distL="0" distR="0" wp14:anchorId="0C9E0119" wp14:editId="0F44B106">
+            <wp:extent cx="3986784" cy="3108960"/>
             <wp:effectExtent l="0" t="0" r="0" b="0"/>
             <wp:docPr id="3" name="Picture 3"/>
             <wp:cNvGraphicFramePr>
@@ -4726,20 +4710,27 @@
                     <pic:cNvPr id="0" name="agile.png"/>
                     <pic:cNvPicPr/>
                   </pic:nvPicPr>
-                  <pic:blipFill>
+                  <pic:blipFill rotWithShape="1">
                     <a:blip r:embed="rId10"/>
-                    <a:stretch>
-                      <a:fillRect/>
-                    </a:stretch>
+                    <a:srcRect l="1" r="27236"/>
+                    <a:stretch/>
                   </pic:blipFill>
-                  <pic:spPr>
+                  <pic:spPr bwMode="auto">
                     <a:xfrm>
                       <a:off x="0" y="0"/>
-                      <a:ext cx="5486400" cy="3108960"/>
+                      <a:ext cx="3986784" cy="3108960"/>
                     </a:xfrm>
                     <a:prstGeom prst="rect">
                       <a:avLst/>
                     </a:prstGeom>
+                    <a:ln>
+                      <a:noFill/>
+                    </a:ln>
+                    <a:extLst>
+                      <a:ext uri="{53640926-AAD7-44D8-BBD7-CCE9431645EC}">
+                        <a14:shadowObscured xmlns:a14="http://schemas.microsoft.com/office/drawing/2010/main"/>
+                      </a:ext>
+                    </a:extLst>
                   </pic:spPr>
                 </pic:pic>
               </a:graphicData>
@@ -4781,12 +4772,12 @@
       </w:pPr>
       <w:r>
         <w:lastRenderedPageBreak/>
-        <w:t>The diagram follows the sample's requirements-to-build structure, expanded to the five modules. Return arrows indicate feedback and revision. This sequence organizes the methodology and does not represent verified historical dates.</w:t>
+        <w:t>The diagram follows the sample's requirements-to-build structure, expanded to the six modules (Inventory, Costing and pricing, Orders and waybills, Parcel processing, Return-to-Sender, and Point of Sale — Web and Mobile POS). Return arrows indicate feedback and revision. This sequence matches the Build sections that follow.</w:t>
       </w:r>
     </w:p>
     <w:p>
       <w:pPr>
-        <w:pStyle w:val="Heading3"/>
+        <w:pStyle w:val="CapHeading3"/>
       </w:pPr>
       <w:bookmarkStart w:id="22" w:name="_Toc240538989"/>
       <w:r>
@@ -4812,7 +4803,7 @@
     </w:p>
     <w:p>
       <w:pPr>
-        <w:pStyle w:val="Heading3"/>
+        <w:pStyle w:val="CapHeading3"/>
       </w:pPr>
       <w:bookmarkStart w:id="23" w:name="_Toc240538990"/>
       <w:r>
@@ -4842,7 +4833,7 @@
     </w:p>
     <w:p>
       <w:pPr>
-        <w:pStyle w:val="Heading3"/>
+        <w:pStyle w:val="CapHeading3"/>
       </w:pPr>
       <w:bookmarkStart w:id="24" w:name="_Toc240538991"/>
       <w:r>
@@ -4868,7 +4859,7 @@
     </w:p>
     <w:p>
       <w:pPr>
-        <w:pStyle w:val="Heading3"/>
+        <w:pStyle w:val="CapHeading3"/>
       </w:pPr>
       <w:bookmarkStart w:id="25" w:name="_Toc240538992"/>
       <w:r>
@@ -4898,7 +4889,7 @@
     </w:p>
     <w:p>
       <w:pPr>
-        <w:pStyle w:val="Heading3"/>
+        <w:pStyle w:val="CapHeading3"/>
       </w:pPr>
       <w:bookmarkStart w:id="26" w:name="_Toc240538993"/>
       <w:r>
@@ -4924,7 +4915,36 @@
     </w:p>
     <w:p>
       <w:pPr>
-        <w:pStyle w:val="Heading2"/>
+        <w:pStyle w:val="CapHeading3"/>
+        <w:jc w:val="both"/>
+      </w:pPr>
+      <w:r>
+        <w:t>Build 6 Point of Sale System (Web and Mobile)</w:t>
+      </w:r>
+    </w:p>
+    <w:p>
+      <w:pPr>
+        <w:jc w:val="both"/>
+      </w:pPr>
+      <w:r>
+        <w:t xml:space="preserve">Design and development implement walk-in sales on the web POS and on the Android Mobile POS application documented in the POS-PrinterDriver-Mobile </w:t>
+      </w:r>
+      <w:r>
+        <w:lastRenderedPageBreak/>
+        <w:t>repository (https://github.com/diobrandedd/POS-PrinterDriver-Mobile). Staff authenticate through POS credentials or assigned Mobile POS staff login with Bearer tokens, scan barcodes, complete cash or accounts-receivable checkout, and print thermal receipts through Bluetooth, USB, or Wi-Fi ESC/POS connections. Sales, reprints, and full-sale refunds update the shared RTS inventory and receipt records.</w:t>
+      </w:r>
+    </w:p>
+    <w:p>
+      <w:pPr>
+        <w:jc w:val="both"/>
+      </w:pPr>
+      <w:r>
+        <w:t>Testing verifies successful login for authorized Mobile POS staff, sale posting with inventory deduction, receipt generation or print path availability, sales-history retrieval, and refund restock behavior. Unauthorized staff and unreachable API endpoints are treated as exception cases. Claims of completed field evaluation remain limited to available test records.</w:t>
+      </w:r>
+    </w:p>
+    <w:p>
+      <w:pPr>
+        <w:pStyle w:val="CapHeading2"/>
       </w:pPr>
       <w:bookmarkStart w:id="27" w:name="_Toc240538994"/>
       <w:r>
@@ -4935,7 +4955,7 @@
     </w:p>
     <w:p>
       <w:pPr>
-        <w:pStyle w:val="Heading3"/>
+        <w:pStyle w:val="CapHeading3"/>
       </w:pPr>
       <w:bookmarkStart w:id="28" w:name="_Toc240538995"/>
       <w:r>
@@ -4955,7 +4975,7 @@
           <w:noProof/>
         </w:rPr>
         <w:drawing>
-          <wp:inline distT="0" distB="0" distL="0" distR="0" wp14:anchorId="767CE189" wp14:editId="2FE53B9B">
+          <wp:inline distT="0" distB="0" distL="0" distR="0" wp14:anchorId="308E1EB5" wp14:editId="573CCA50">
             <wp:extent cx="5455577" cy="5394959"/>
             <wp:effectExtent l="0" t="0" r="0" b="0"/>
             <wp:docPr id="4" name="Picture 4"/>
@@ -5020,22 +5040,11 @@
     </w:p>
     <w:p>
       <w:pPr>
-        <w:jc w:val="both"/>
-      </w:pPr>
-      <w:r>
-        <w:t xml:space="preserve">The canvas follows the sample's nine blocks: partners, activities, resources, value proposition, customer relationships, channels, customer segments, cost </w:t>
-      </w:r>
-      <w:r>
-        <w:lastRenderedPageBreak/>
-        <w:t>structure, and revenue streams. It represents the food business supported by the system. Pyx Tracker is an internal resource; the canvas does not invent software-subscription income, market-size figures, or financial amounts.</w:t>
-      </w:r>
-    </w:p>
-    <w:p>
-      <w:pPr>
-        <w:pStyle w:val="Heading3"/>
+        <w:pStyle w:val="CapHeading3"/>
       </w:pPr>
       <w:bookmarkStart w:id="29" w:name="_Toc240538996"/>
       <w:r>
+        <w:lastRenderedPageBreak/>
         <w:t>Gantt Chart</w:t>
       </w:r>
       <w:bookmarkEnd w:id="29"/>
@@ -5052,7 +5061,7 @@
           <w:noProof/>
         </w:rPr>
         <w:drawing>
-          <wp:inline distT="0" distB="0" distL="0" distR="0" wp14:anchorId="082C8673" wp14:editId="2F2E94CA">
+          <wp:inline distT="0" distB="0" distL="0" distR="0" wp14:anchorId="522A409E" wp14:editId="39FDDA45">
             <wp:extent cx="5486400" cy="4693920"/>
             <wp:effectExtent l="0" t="0" r="0" b="0"/>
             <wp:docPr id="5" name="Picture 5"/>
@@ -5117,22 +5126,11 @@
     </w:p>
     <w:p>
       <w:pPr>
-        <w:jc w:val="both"/>
-      </w:pPr>
-      <w:r>
-        <w:t xml:space="preserve">System development starts in May and ends in August. Each of the five features has Design and Development, Testing, and Implementation activities. The </w:t>
-      </w:r>
-      <w:r>
-        <w:lastRenderedPageBreak/>
-        <w:t>four numbered intervals in each month organize the schedule. Activity bars show a proposed allocation within the stated development period; exact milestone dates should be reconciled with project records.</w:t>
-      </w:r>
-    </w:p>
-    <w:p>
-      <w:pPr>
-        <w:pStyle w:val="Heading3"/>
+        <w:pStyle w:val="CapHeading3"/>
       </w:pPr>
       <w:bookmarkStart w:id="30" w:name="_Toc240538997"/>
       <w:r>
+        <w:lastRenderedPageBreak/>
         <w:t>Functional Decomposition Diagram</w:t>
       </w:r>
       <w:bookmarkEnd w:id="30"/>
@@ -5149,7 +5147,7 @@
           <w:noProof/>
         </w:rPr>
         <w:drawing>
-          <wp:inline distT="0" distB="0" distL="0" distR="0" wp14:anchorId="290EC6E7" wp14:editId="36F14444">
+          <wp:inline distT="0" distB="0" distL="0" distR="0" wp14:anchorId="5AAB5FFB" wp14:editId="7B8E14FE">
             <wp:extent cx="5486400" cy="4175760"/>
             <wp:effectExtent l="0" t="0" r="0" b="0"/>
             <wp:docPr id="6" name="Picture 6"/>
@@ -5214,15 +5212,7 @@
     </w:p>
     <w:p>
       <w:pPr>
-        <w:jc w:val="both"/>
-      </w:pPr>
-      <w:r>
-        <w:t>The FDD decomposes the root into five modules and their subfunctions, following the sample's system-to-function-to-subfunction hierarchy. It represents responsibility, not screen navigation or execution order. Shared authentication, permissions, and reporting support the branches.</w:t>
-      </w:r>
-    </w:p>
-    <w:p>
-      <w:pPr>
-        <w:pStyle w:val="Heading2"/>
+        <w:pStyle w:val="CapHeading2"/>
       </w:pPr>
       <w:bookmarkStart w:id="31" w:name="_Toc240538998"/>
       <w:r>
@@ -5233,71 +5223,25 @@
     </w:p>
     <w:p>
       <w:pPr>
-        <w:pStyle w:val="Heading3"/>
+        <w:pStyle w:val="CapHeading3"/>
       </w:pPr>
       <w:bookmarkStart w:id="32" w:name="_Toc240538999"/>
-      <w:r>
-        <w:t>Use Case Diagrams</w:t>
-      </w:r>
-      <w:bookmarkEnd w:id="32"/>
-    </w:p>
-    <w:p>
-      <w:pPr>
-        <w:jc w:val="both"/>
-      </w:pPr>
-      <w:r>
-        <w:t xml:space="preserve">The use case diagram follows the five features and twenty </w:t>
-      </w:r>
-      <w:proofErr w:type="spellStart"/>
-      <w:r>
-        <w:t>subfeatures</w:t>
-      </w:r>
-      <w:proofErr w:type="spellEnd"/>
-      <w:r>
-        <w:t xml:space="preserve"> in the Functional Decomposition Diagram. Main features appear in the first column of ovals beside each actor, and their </w:t>
-      </w:r>
-      <w:proofErr w:type="spellStart"/>
-      <w:r>
-        <w:t>subfeatures</w:t>
-      </w:r>
-      <w:proofErr w:type="spellEnd"/>
-      <w:r>
-        <w:t xml:space="preserve"> appear in the adjacent column. Solid lines connect Admin/Executive or Staff to the main features. Dashed arrows labeled «include» connect each main feature to its four FDD </w:t>
-      </w:r>
-      <w:proofErr w:type="spellStart"/>
-      <w:r>
-        <w:t>subfeatures</w:t>
-      </w:r>
-      <w:proofErr w:type="spellEnd"/>
-      <w:r>
-        <w:t xml:space="preserve">. The diagram presents the supported functions at feature level; it does not imply that every </w:t>
-      </w:r>
-      <w:proofErr w:type="spellStart"/>
-      <w:r>
-        <w:t>subfeature</w:t>
-      </w:r>
-      <w:proofErr w:type="spellEnd"/>
-      <w:r>
-        <w:t xml:space="preserve"> runs during every individual transaction. Admin/Executive maintains costing and pricing, while Staff performs the operational inventory, order, parcel, and return functions. No additional optional function is introduced through an «extend» relationship.</w:t>
-      </w:r>
-    </w:p>
-    <w:p>
-      <w:pPr>
-        <w:keepNext/>
-        <w:pageBreakBefore/>
-        <w:spacing w:line="240" w:lineRule="auto"/>
-        <w:ind w:firstLine="0"/>
-        <w:jc w:val="center"/>
-      </w:pPr>
       <w:r>
         <w:rPr>
           <w:noProof/>
         </w:rPr>
-        <w:lastRenderedPageBreak/>
         <w:drawing>
-          <wp:inline distT="0" distB="0" distL="0" distR="0" wp14:anchorId="60D4AEF5" wp14:editId="5A48C711">
-            <wp:extent cx="5486400" cy="5157216"/>
-            <wp:effectExtent l="0" t="0" r="0" b="0"/>
+          <wp:anchor distT="0" distB="0" distL="114300" distR="114300" simplePos="0" relativeHeight="251669504" behindDoc="0" locked="0" layoutInCell="1" allowOverlap="1" wp14:anchorId="14C85B4C" wp14:editId="6563325F">
+            <wp:simplePos x="0" y="0"/>
+            <wp:positionH relativeFrom="margin">
+              <wp:align>right</wp:align>
+            </wp:positionH>
+            <wp:positionV relativeFrom="paragraph">
+              <wp:posOffset>325755</wp:posOffset>
+            </wp:positionV>
+            <wp:extent cx="5486400" cy="5156835"/>
+            <wp:effectExtent l="0" t="0" r="0" b="5715"/>
+            <wp:wrapSquare wrapText="bothSides"/>
             <wp:docPr id="7" name="Picture 7"/>
             <wp:cNvGraphicFramePr>
               <a:graphicFrameLocks xmlns:a="http://schemas.openxmlformats.org/drawingml/2006/main" noChangeAspect="1"/>
@@ -5310,7 +5254,13 @@
                     <pic:cNvPicPr/>
                   </pic:nvPicPr>
                   <pic:blipFill>
-                    <a:blip r:embed="rId14"/>
+                    <a:blip r:embed="rId14" cstate="print">
+                      <a:extLst>
+                        <a:ext uri="{28A0092B-C50C-407E-A947-70E740481C1C}">
+                          <a14:useLocalDpi xmlns:a14="http://schemas.microsoft.com/office/drawing/2010/main" val="0"/>
+                        </a:ext>
+                      </a:extLst>
+                    </a:blip>
                     <a:stretch>
                       <a:fillRect/>
                     </a:stretch>
@@ -5318,7 +5268,7 @@
                   <pic:spPr>
                     <a:xfrm>
                       <a:off x="0" y="0"/>
-                      <a:ext cx="5486400" cy="5157216"/>
+                      <a:ext cx="5486400" cy="5156835"/>
                     </a:xfrm>
                     <a:prstGeom prst="rect">
                       <a:avLst/>
@@ -5327,9 +5277,13 @@
                 </pic:pic>
               </a:graphicData>
             </a:graphic>
-          </wp:inline>
+          </wp:anchor>
         </w:drawing>
       </w:r>
+      <w:r>
+        <w:t>Use Case Diagrams</w:t>
+      </w:r>
+      <w:bookmarkEnd w:id="32"/>
     </w:p>
     <w:p>
       <w:pPr>
@@ -5341,26 +5295,26 @@
         <w:rPr>
           <w:sz w:val="22"/>
         </w:rPr>
-        <w:t xml:space="preserve">Figure </w:t>
+        <w:t xml:space="preserve">Figure 3.5 presents the overall Use Case Diagram of Pyx Tracker using the same clean UML layout as the institutional sample: actors outside the boundary, short association lines that do not cross through ovals, and &lt;&lt;include&gt;&gt; / &lt;&lt;extend&gt;&gt; dependencies. Use cases follow the approved features and Figure 3.4 FDD modules—Integrated Inventory Management, Product Costing and Pricing, Multi-Platform Orders and Waybills, Parcel Processing and Inventory Sync, Return-to-Sender Management, and Point of Sale (Web + Mobile POS)—with Executive and HR on oversight and Staff on operations.</w:t>
       </w:r>
       <w:proofErr w:type="gramStart"/>
       <w:r>
         <w:rPr>
           <w:sz w:val="22"/>
         </w:rPr>
-        <w:t>3.5  Overall</w:t>
+        <w:t/>
       </w:r>
       <w:proofErr w:type="gramEnd"/>
       <w:r>
         <w:rPr>
           <w:sz w:val="22"/>
         </w:rPr>
-        <w:t xml:space="preserve"> Use Case Diagram of Pyx Tracker</w:t>
+        <w:t xml:space="preserve"/>
       </w:r>
     </w:p>
     <w:p>
       <w:pPr>
-        <w:pStyle w:val="Heading3"/>
+        <w:pStyle w:val="CapHeading3"/>
         <w:pageBreakBefore/>
       </w:pPr>
       <w:bookmarkStart w:id="33" w:name="_Toc240539000"/>
@@ -5381,19 +5335,21 @@
         <w:rPr>
           <w:sz w:val="22"/>
         </w:rPr>
-        <w:t>Table 3.1  Use Case Matrix of Pyx Tracker: Web-based Enterprise Operations Management System.</w:t>
+        <w:t xml:space="preserve">Table </w:t>
       </w:r>
       <w:proofErr w:type="gramStart"/>
       <w:r>
         <w:rPr>
           <w:sz w:val="22"/>
         </w:rPr>
+        <w:t>3.1  Use</w:t>
       </w:r>
       <w:proofErr w:type="gramEnd"/>
       <w:r>
         <w:rPr>
           <w:sz w:val="22"/>
         </w:rPr>
+        <w:t xml:space="preserve"> Case Matrix of Pyx Tracker: Web-based Enterprise Operations Management System.</w:t>
       </w:r>
     </w:p>
     <w:tbl>
@@ -5407,115 +5363,26 @@
           <w:insideH w:val="single" w:sz="4" w:space="0" w:color="000000"/>
           <w:insideV w:val="single" w:sz="4" w:space="0" w:color="000000"/>
         </w:tblBorders>
+        <w:tblLook w:val="04A0" w:firstRow="1" w:lastRow="0" w:firstColumn="1" w:lastColumn="0" w:noHBand="0" w:noVBand="1"/>
       </w:tblPr>
       <w:tblGrid>
-        <w:gridCol w:w="900"/>
-        <w:gridCol w:w="900"/>
-        <w:gridCol w:w="900"/>
-        <w:gridCol w:w="900"/>
-        <w:gridCol w:w="900"/>
-        <w:gridCol w:w="900"/>
+        <w:gridCol w:w="2241"/>
+        <w:gridCol w:w="6389"/>
       </w:tblGrid>
       <w:tr>
         <w:tc>
           <w:tcPr>
-            <w:tcW w:w="900" w:type="dxa"/>
-            <w:shd w:fill="2F80ED" w:val="clear"/>
+            <w:tcW w:w="9000" w:type="dxa"/>
+            <w:gridSpan w:val="2"/>
           </w:tcPr>
           <w:p>
             <w:r>
               <w:rPr>
                 <w:rFonts w:ascii="Times New Roman" w:hAnsi="Times New Roman"/>
-                <w:sz w:val="14"/>
                 <w:b/>
-                <w:color w:val="FFFFFF"/>
-              </w:rPr>
-              <w:t xml:space="preserve">Element</w:t>
-            </w:r>
-          </w:p>
-        </w:tc>
-        <w:tc>
-          <w:tcPr>
-            <w:tcW w:w="900" w:type="dxa"/>
-            <w:shd w:fill="2F80ED" w:val="clear"/>
-          </w:tcPr>
-          <w:p>
-            <w:r>
-              <w:rPr>
-                <w:rFonts w:ascii="Times New Roman" w:hAnsi="Times New Roman"/>
-                <w:sz w:val="14"/>
-                <w:b/>
-                <w:color w:val="FFFFFF"/>
-              </w:rPr>
-              <w:t xml:space="preserve">UC01 Inventory stock movement</w:t>
-            </w:r>
-          </w:p>
-        </w:tc>
-        <w:tc>
-          <w:tcPr>
-            <w:tcW w:w="900" w:type="dxa"/>
-            <w:shd w:fill="2F80ED" w:val="clear"/>
-          </w:tcPr>
-          <w:p>
-            <w:r>
-              <w:rPr>
-                <w:rFonts w:ascii="Times New Roman" w:hAnsi="Times New Roman"/>
-                <w:sz w:val="14"/>
-                <w:b/>
-                <w:color w:val="FFFFFF"/>
-              </w:rPr>
-              <w:t xml:space="preserve">UC02 Product and parcel costing</w:t>
-            </w:r>
-          </w:p>
-        </w:tc>
-        <w:tc>
-          <w:tcPr>
-            <w:tcW w:w="900" w:type="dxa"/>
-            <w:shd w:fill="2F80ED" w:val="clear"/>
-          </w:tcPr>
-          <w:p>
-            <w:r>
-              <w:rPr>
-                <w:rFonts w:ascii="Times New Roman" w:hAnsi="Times New Roman"/>
-                <w:sz w:val="14"/>
-                <w:b/>
-                <w:color w:val="FFFFFF"/>
-              </w:rPr>
-              <w:t xml:space="preserve">UC03 Order preparation and finalization</w:t>
-            </w:r>
-          </w:p>
-        </w:tc>
-        <w:tc>
-          <w:tcPr>
-            <w:tcW w:w="900" w:type="dxa"/>
-            <w:shd w:fill="2F80ED" w:val="clear"/>
-          </w:tcPr>
-          <w:p>
-            <w:r>
-              <w:rPr>
-                <w:rFonts w:ascii="Times New Roman" w:hAnsi="Times New Roman"/>
-                <w:sz w:val="14"/>
-                <w:b/>
-                <w:color w:val="FFFFFF"/>
-              </w:rPr>
-              <w:t xml:space="preserve">UC04 Before-shipment documentation</w:t>
-            </w:r>
-          </w:p>
-        </w:tc>
-        <w:tc>
-          <w:tcPr>
-            <w:tcW w:w="900" w:type="dxa"/>
-            <w:shd w:fill="2F80ED" w:val="clear"/>
-          </w:tcPr>
-          <w:p>
-            <w:r>
-              <w:rPr>
-                <w:rFonts w:ascii="Times New Roman" w:hAnsi="Times New Roman"/>
-                <w:sz w:val="14"/>
-                <w:b/>
-                <w:color w:val="FFFFFF"/>
-              </w:rPr>
-              <w:t xml:space="preserve">UC05 RTS case and sellable stock-in</w:t>
+                <w:sz w:val="22"/>
+              </w:rPr>
+              <w:t>General Characteristics</w:t>
             </w:r>
           </w:p>
         </w:tc>
@@ -5523,92 +5390,33 @@
       <w:tr>
         <w:tc>
           <w:tcPr>
-            <w:tcW w:w="900" w:type="dxa"/>
-            <w:shd w:fill="FFFFFF" w:val="clear"/>
+            <w:tcW w:w="2250" w:type="dxa"/>
           </w:tcPr>
           <w:p>
             <w:r>
               <w:rPr>
                 <w:rFonts w:ascii="Times New Roman" w:hAnsi="Times New Roman"/>
-                <w:sz w:val="14"/>
                 <w:b/>
-              </w:rPr>
-              <w:t xml:space="preserve">Use case</w:t>
-            </w:r>
-          </w:p>
-        </w:tc>
-        <w:tc>
-          <w:tcPr>
-            <w:tcW w:w="900" w:type="dxa"/>
-            <w:shd w:fill="FFFFFF" w:val="clear"/>
-          </w:tcPr>
-          <w:p>
+                <w:sz w:val="22"/>
+              </w:rPr>
+              <w:t>Intent</w:t>
+            </w:r>
+          </w:p>
+        </w:tc>
+        <w:tc>
+          <w:tcPr>
+            <w:tcW w:w="6750" w:type="dxa"/>
+          </w:tcPr>
+          <w:p>
+            <w:pPr>
+              <w:jc w:val="center"/>
+            </w:pPr>
             <w:r>
               <w:rPr>
                 <w:rFonts w:ascii="Times New Roman" w:hAnsi="Times New Roman"/>
-                <w:sz w:val="14"/>
-              </w:rPr>
-              <w:t xml:space="preserve">UC01 Inventory stock movement</w:t>
-            </w:r>
-          </w:p>
-        </w:tc>
-        <w:tc>
-          <w:tcPr>
-            <w:tcW w:w="900" w:type="dxa"/>
-            <w:shd w:fill="FFFFFF" w:val="clear"/>
-          </w:tcPr>
-          <w:p>
-            <w:r>
-              <w:rPr>
-                <w:rFonts w:ascii="Times New Roman" w:hAnsi="Times New Roman"/>
-                <w:sz w:val="14"/>
-              </w:rPr>
-              <w:t xml:space="preserve">UC02 Product and parcel costing</w:t>
-            </w:r>
-          </w:p>
-        </w:tc>
-        <w:tc>
-          <w:tcPr>
-            <w:tcW w:w="900" w:type="dxa"/>
-            <w:shd w:fill="FFFFFF" w:val="clear"/>
-          </w:tcPr>
-          <w:p>
-            <w:r>
-              <w:rPr>
-                <w:rFonts w:ascii="Times New Roman" w:hAnsi="Times New Roman"/>
-                <w:sz w:val="14"/>
-              </w:rPr>
-              <w:t xml:space="preserve">UC03 Order preparation and finalization</w:t>
-            </w:r>
-          </w:p>
-        </w:tc>
-        <w:tc>
-          <w:tcPr>
-            <w:tcW w:w="900" w:type="dxa"/>
-            <w:shd w:fill="FFFFFF" w:val="clear"/>
-          </w:tcPr>
-          <w:p>
-            <w:r>
-              <w:rPr>
-                <w:rFonts w:ascii="Times New Roman" w:hAnsi="Times New Roman"/>
-                <w:sz w:val="14"/>
-              </w:rPr>
-              <w:t xml:space="preserve">UC04 Before-shipment documentation</w:t>
-            </w:r>
-          </w:p>
-        </w:tc>
-        <w:tc>
-          <w:tcPr>
-            <w:tcW w:w="900" w:type="dxa"/>
-            <w:shd w:fill="FFFFFF" w:val="clear"/>
-          </w:tcPr>
-          <w:p>
-            <w:r>
-              <w:rPr>
-                <w:rFonts w:ascii="Times New Roman" w:hAnsi="Times New Roman"/>
-                <w:sz w:val="14"/>
-              </w:rPr>
-              <w:t xml:space="preserve">UC05 RTS case and sellable stock-in</w:t>
+                <w:sz w:val="22"/>
+              </w:rPr>
+              <w:t>To identify the purpose of each feature of Pyx Tracker: Web-based Enterprise Operations Management System for Pyx Food Products.</w:t>
             </w:r>
           </w:p>
         </w:tc>
@@ -5616,92 +5424,33 @@
       <w:tr>
         <w:tc>
           <w:tcPr>
-            <w:tcW w:w="900" w:type="dxa"/>
-            <w:shd w:fill="D6EAF8" w:val="clear"/>
+            <w:tcW w:w="2250" w:type="dxa"/>
           </w:tcPr>
           <w:p>
             <w:r>
               <w:rPr>
                 <w:rFonts w:ascii="Times New Roman" w:hAnsi="Times New Roman"/>
-                <w:sz w:val="14"/>
                 <w:b/>
-              </w:rPr>
-              <w:t xml:space="preserve">Author</w:t>
-            </w:r>
-          </w:p>
-        </w:tc>
-        <w:tc>
-          <w:tcPr>
-            <w:tcW w:w="900" w:type="dxa"/>
-            <w:shd w:fill="D6EAF8" w:val="clear"/>
-          </w:tcPr>
-          <w:p>
+                <w:sz w:val="22"/>
+              </w:rPr>
+              <w:t>Scope</w:t>
+            </w:r>
+          </w:p>
+        </w:tc>
+        <w:tc>
+          <w:tcPr>
+            <w:tcW w:w="6750" w:type="dxa"/>
+          </w:tcPr>
+          <w:p>
+            <w:pPr>
+              <w:jc w:val="center"/>
+            </w:pPr>
             <w:r>
               <w:rPr>
                 <w:rFonts w:ascii="Times New Roman" w:hAnsi="Times New Roman"/>
-                <w:sz w:val="14"/>
-              </w:rPr>
-              <w:t xml:space="preserve">Cayunda, Klint Russel R.; Delos Santos, Brent R.; Fin, Noli III M.</w:t>
-            </w:r>
-          </w:p>
-        </w:tc>
-        <w:tc>
-          <w:tcPr>
-            <w:tcW w:w="900" w:type="dxa"/>
-            <w:shd w:fill="D6EAF8" w:val="clear"/>
-          </w:tcPr>
-          <w:p>
-            <w:r>
-              <w:rPr>
-                <w:rFonts w:ascii="Times New Roman" w:hAnsi="Times New Roman"/>
-                <w:sz w:val="14"/>
-              </w:rPr>
-              <w:t xml:space="preserve">Cayunda, Klint Russel R.; Delos Santos, Brent R.; Fin, Noli III M.</w:t>
-            </w:r>
-          </w:p>
-        </w:tc>
-        <w:tc>
-          <w:tcPr>
-            <w:tcW w:w="900" w:type="dxa"/>
-            <w:shd w:fill="D6EAF8" w:val="clear"/>
-          </w:tcPr>
-          <w:p>
-            <w:r>
-              <w:rPr>
-                <w:rFonts w:ascii="Times New Roman" w:hAnsi="Times New Roman"/>
-                <w:sz w:val="14"/>
-              </w:rPr>
-              <w:t xml:space="preserve">Cayunda, Klint Russel R.; Delos Santos, Brent R.; Fin, Noli III M.</w:t>
-            </w:r>
-          </w:p>
-        </w:tc>
-        <w:tc>
-          <w:tcPr>
-            <w:tcW w:w="900" w:type="dxa"/>
-            <w:shd w:fill="D6EAF8" w:val="clear"/>
-          </w:tcPr>
-          <w:p>
-            <w:r>
-              <w:rPr>
-                <w:rFonts w:ascii="Times New Roman" w:hAnsi="Times New Roman"/>
-                <w:sz w:val="14"/>
-              </w:rPr>
-              <w:t xml:space="preserve">Cayunda, Klint Russel R.; Delos Santos, Brent R.; Fin, Noli III M.</w:t>
-            </w:r>
-          </w:p>
-        </w:tc>
-        <w:tc>
-          <w:tcPr>
-            <w:tcW w:w="900" w:type="dxa"/>
-            <w:shd w:fill="D6EAF8" w:val="clear"/>
-          </w:tcPr>
-          <w:p>
-            <w:r>
-              <w:rPr>
-                <w:rFonts w:ascii="Times New Roman" w:hAnsi="Times New Roman"/>
-                <w:sz w:val="14"/>
-              </w:rPr>
-              <w:t xml:space="preserve">Cayunda, Klint Russel R.; Delos Santos, Brent R.; Fin, Noli III M.</w:t>
+                <w:sz w:val="22"/>
+              </w:rPr>
+              <w:t>The scope of this use case is Admin/Executive and Staff only.</w:t>
             </w:r>
           </w:p>
         </w:tc>
@@ -5709,92 +5458,33 @@
       <w:tr>
         <w:tc>
           <w:tcPr>
-            <w:tcW w:w="900" w:type="dxa"/>
-            <w:shd w:fill="FFFFFF" w:val="clear"/>
+            <w:tcW w:w="2250" w:type="dxa"/>
           </w:tcPr>
           <w:p>
             <w:r>
               <w:rPr>
                 <w:rFonts w:ascii="Times New Roman" w:hAnsi="Times New Roman"/>
-                <w:sz w:val="14"/>
                 <w:b/>
-              </w:rPr>
-              <w:t xml:space="preserve">Primary actor</w:t>
-            </w:r>
-          </w:p>
-        </w:tc>
-        <w:tc>
-          <w:tcPr>
-            <w:tcW w:w="900" w:type="dxa"/>
-            <w:shd w:fill="FFFFFF" w:val="clear"/>
-          </w:tcPr>
-          <w:p>
+                <w:sz w:val="22"/>
+              </w:rPr>
+              <w:t>Level</w:t>
+            </w:r>
+          </w:p>
+        </w:tc>
+        <w:tc>
+          <w:tcPr>
+            <w:tcW w:w="6750" w:type="dxa"/>
+          </w:tcPr>
+          <w:p>
+            <w:pPr>
+              <w:jc w:val="center"/>
+            </w:pPr>
             <w:r>
               <w:rPr>
                 <w:rFonts w:ascii="Times New Roman" w:hAnsi="Times New Roman"/>
-                <w:sz w:val="14"/>
-              </w:rPr>
-              <w:t xml:space="preserve">Admin/Executive and Staff</w:t>
-            </w:r>
-          </w:p>
-        </w:tc>
-        <w:tc>
-          <w:tcPr>
-            <w:tcW w:w="900" w:type="dxa"/>
-            <w:shd w:fill="FFFFFF" w:val="clear"/>
-          </w:tcPr>
-          <w:p>
-            <w:r>
-              <w:rPr>
-                <w:rFonts w:ascii="Times New Roman" w:hAnsi="Times New Roman"/>
-                <w:sz w:val="14"/>
-              </w:rPr>
-              <w:t xml:space="preserve">Admin/Executive</w:t>
-            </w:r>
-          </w:p>
-        </w:tc>
-        <w:tc>
-          <w:tcPr>
-            <w:tcW w:w="900" w:type="dxa"/>
-            <w:shd w:fill="FFFFFF" w:val="clear"/>
-          </w:tcPr>
-          <w:p>
-            <w:r>
-              <w:rPr>
-                <w:rFonts w:ascii="Times New Roman" w:hAnsi="Times New Roman"/>
-                <w:sz w:val="14"/>
-              </w:rPr>
-              <w:t xml:space="preserve">Admin/Executive and Staff</w:t>
-            </w:r>
-          </w:p>
-        </w:tc>
-        <w:tc>
-          <w:tcPr>
-            <w:tcW w:w="900" w:type="dxa"/>
-            <w:shd w:fill="FFFFFF" w:val="clear"/>
-          </w:tcPr>
-          <w:p>
-            <w:r>
-              <w:rPr>
-                <w:rFonts w:ascii="Times New Roman" w:hAnsi="Times New Roman"/>
-                <w:sz w:val="14"/>
-              </w:rPr>
-              <w:t xml:space="preserve">Admin/Executive and Staff</w:t>
-            </w:r>
-          </w:p>
-        </w:tc>
-        <w:tc>
-          <w:tcPr>
-            <w:tcW w:w="900" w:type="dxa"/>
-            <w:shd w:fill="FFFFFF" w:val="clear"/>
-          </w:tcPr>
-          <w:p>
-            <w:r>
-              <w:rPr>
-                <w:rFonts w:ascii="Times New Roman" w:hAnsi="Times New Roman"/>
-                <w:sz w:val="14"/>
-              </w:rPr>
-              <w:t xml:space="preserve">Admin/Executive and Staff</w:t>
+                <w:sz w:val="22"/>
+              </w:rPr>
+              <w:t>2nd Level (user-goal level).</w:t>
             </w:r>
           </w:p>
         </w:tc>
@@ -5802,92 +5492,33 @@
       <w:tr>
         <w:tc>
           <w:tcPr>
-            <w:tcW w:w="900" w:type="dxa"/>
-            <w:shd w:fill="D6EAF8" w:val="clear"/>
+            <w:tcW w:w="2250" w:type="dxa"/>
           </w:tcPr>
           <w:p>
             <w:r>
               <w:rPr>
                 <w:rFonts w:ascii="Times New Roman" w:hAnsi="Times New Roman"/>
-                <w:sz w:val="14"/>
                 <w:b/>
-              </w:rPr>
-              <w:t xml:space="preserve">Trigger</w:t>
-            </w:r>
-          </w:p>
-        </w:tc>
-        <w:tc>
-          <w:tcPr>
-            <w:tcW w:w="900" w:type="dxa"/>
-            <w:shd w:fill="D6EAF8" w:val="clear"/>
-          </w:tcPr>
-          <w:p>
+                <w:sz w:val="22"/>
+              </w:rPr>
+              <w:t>Authors</w:t>
+            </w:r>
+          </w:p>
+        </w:tc>
+        <w:tc>
+          <w:tcPr>
+            <w:tcW w:w="6750" w:type="dxa"/>
+          </w:tcPr>
+          <w:p>
+            <w:pPr>
+              <w:jc w:val="center"/>
+            </w:pPr>
             <w:r>
               <w:rPr>
                 <w:rFonts w:ascii="Times New Roman" w:hAnsi="Times New Roman"/>
-                <w:sz w:val="14"/>
-              </w:rPr>
-              <w:t xml:space="preserve">Material receipt or finished-stock operation</w:t>
-            </w:r>
-          </w:p>
-        </w:tc>
-        <w:tc>
-          <w:tcPr>
-            <w:tcW w:w="900" w:type="dxa"/>
-            <w:shd w:fill="D6EAF8" w:val="clear"/>
-          </w:tcPr>
-          <w:p>
-            <w:r>
-              <w:rPr>
-                <w:rFonts w:ascii="Times New Roman" w:hAnsi="Times New Roman"/>
-                <w:sz w:val="14"/>
-              </w:rPr>
-              <w:t xml:space="preserve">Review or update of product costs</w:t>
-            </w:r>
-          </w:p>
-        </w:tc>
-        <w:tc>
-          <w:tcPr>
-            <w:tcW w:w="900" w:type="dxa"/>
-            <w:shd w:fill="D6EAF8" w:val="clear"/>
-          </w:tcPr>
-          <w:p>
-            <w:r>
-              <w:rPr>
-                <w:rFonts w:ascii="Times New Roman" w:hAnsi="Times New Roman"/>
-                <w:sz w:val="14"/>
-              </w:rPr>
-              <w:t xml:space="preserve">Receipt of supported order files</w:t>
-            </w:r>
-          </w:p>
-        </w:tc>
-        <w:tc>
-          <w:tcPr>
-            <w:tcW w:w="900" w:type="dxa"/>
-            <w:shd w:fill="D6EAF8" w:val="clear"/>
-          </w:tcPr>
-          <w:p>
-            <w:r>
-              <w:rPr>
-                <w:rFonts w:ascii="Times New Roman" w:hAnsi="Times New Roman"/>
-                <w:sz w:val="14"/>
-              </w:rPr>
-              <w:t xml:space="preserve">Parcel presented for photo recording</w:t>
-            </w:r>
-          </w:p>
-        </w:tc>
-        <w:tc>
-          <w:tcPr>
-            <w:tcW w:w="900" w:type="dxa"/>
-            <w:shd w:fill="D6EAF8" w:val="clear"/>
-          </w:tcPr>
-          <w:p>
-            <w:r>
-              <w:rPr>
-                <w:rFonts w:ascii="Times New Roman" w:hAnsi="Times New Roman"/>
-                <w:sz w:val="14"/>
-              </w:rPr>
-              <w:t xml:space="preserve">Returned parcel received</w:t>
+                <w:sz w:val="22"/>
+              </w:rPr>
+              <w:t>Cayunda, Klint Russel R.; Delos Santos, Brent R.; Fin, Noli III M.</w:t>
             </w:r>
           </w:p>
         </w:tc>
@@ -5895,92 +5526,33 @@
       <w:tr>
         <w:tc>
           <w:tcPr>
-            <w:tcW w:w="900" w:type="dxa"/>
-            <w:shd w:fill="FFFFFF" w:val="clear"/>
+            <w:tcW w:w="2250" w:type="dxa"/>
           </w:tcPr>
           <w:p>
             <w:r>
               <w:rPr>
                 <w:rFonts w:ascii="Times New Roman" w:hAnsi="Times New Roman"/>
-                <w:sz w:val="14"/>
                 <w:b/>
-              </w:rPr>
-              <w:t xml:space="preserve">Preconditions</w:t>
-            </w:r>
-          </w:p>
-        </w:tc>
-        <w:tc>
-          <w:tcPr>
-            <w:tcW w:w="900" w:type="dxa"/>
-            <w:shd w:fill="FFFFFF" w:val="clear"/>
-          </w:tcPr>
-          <w:p>
+                <w:sz w:val="22"/>
+              </w:rPr>
+              <w:t>Last Update</w:t>
+            </w:r>
+          </w:p>
+        </w:tc>
+        <w:tc>
+          <w:tcPr>
+            <w:tcW w:w="6750" w:type="dxa"/>
+          </w:tcPr>
+          <w:p>
+            <w:pPr>
+              <w:jc w:val="center"/>
+            </w:pPr>
             <w:r>
               <w:rPr>
                 <w:rFonts w:ascii="Times New Roman" w:hAnsi="Times New Roman"/>
-                <w:sz w:val="14"/>
-              </w:rPr>
-              <w:t xml:space="preserve">Valid product, stock unit, permission and source record.</w:t>
-            </w:r>
-          </w:p>
-        </w:tc>
-        <w:tc>
-          <w:tcPr>
-            <w:tcW w:w="900" w:type="dxa"/>
-            <w:shd w:fill="FFFFFF" w:val="clear"/>
-          </w:tcPr>
-          <w:p>
-            <w:r>
-              <w:rPr>
-                <w:rFonts w:ascii="Times New Roman" w:hAnsi="Times New Roman"/>
-                <w:sz w:val="14"/>
-              </w:rPr>
-              <w:t xml:space="preserve">Configured material prices, units and formulas.</w:t>
-            </w:r>
-          </w:p>
-        </w:tc>
-        <w:tc>
-          <w:tcPr>
-            <w:tcW w:w="900" w:type="dxa"/>
-            <w:shd w:fill="FFFFFF" w:val="clear"/>
-          </w:tcPr>
-          <w:p>
-            <w:r>
-              <w:rPr>
-                <w:rFonts w:ascii="Times New Roman" w:hAnsi="Times New Roman"/>
-                <w:sz w:val="14"/>
-              </w:rPr>
-              <w:t xml:space="preserve">Supported source files and an active processing batch.</w:t>
-            </w:r>
-          </w:p>
-        </w:tc>
-        <w:tc>
-          <w:tcPr>
-            <w:tcW w:w="900" w:type="dxa"/>
-            <w:shd w:fill="FFFFFF" w:val="clear"/>
-          </w:tcPr>
-          <w:p>
-            <w:r>
-              <w:rPr>
-                <w:rFonts w:ascii="Times New Roman" w:hAnsi="Times New Roman"/>
-                <w:sz w:val="14"/>
-              </w:rPr>
-              <w:t xml:space="preserve">Readable or manually entered tracking identifier and an image.</w:t>
-            </w:r>
-          </w:p>
-        </w:tc>
-        <w:tc>
-          <w:tcPr>
-            <w:tcW w:w="900" w:type="dxa"/>
-            <w:shd w:fill="FFFFFF" w:val="clear"/>
-          </w:tcPr>
-          <w:p>
-            <w:r>
-              <w:rPr>
-                <w:rFonts w:ascii="Times New Roman" w:hAnsi="Times New Roman"/>
-                <w:sz w:val="14"/>
-              </w:rPr>
-              <w:t xml:space="preserve">Tracking or case information, item condition and readable product codes.</w:t>
+                <w:sz w:val="22"/>
+              </w:rPr>
+              <w:t>September 15, 2026</w:t>
             </w:r>
           </w:p>
         </w:tc>
@@ -5988,227 +5560,33 @@
       <w:tr>
         <w:tc>
           <w:tcPr>
-            <w:tcW w:w="900" w:type="dxa"/>
-            <w:shd w:fill="D6EAF8" w:val="clear"/>
+            <w:tcW w:w="2250" w:type="dxa"/>
           </w:tcPr>
           <w:p>
             <w:r>
               <w:rPr>
                 <w:rFonts w:ascii="Times New Roman" w:hAnsi="Times New Roman"/>
-                <w:sz w:val="14"/>
                 <w:b/>
-              </w:rPr>
-              <w:t xml:space="preserve">Basic flow</w:t>
-            </w:r>
-          </w:p>
-        </w:tc>
-        <w:tc>
-          <w:tcPr>
-            <w:tcW w:w="900" w:type="dxa"/>
-            <w:shd w:fill="D6EAF8" w:val="clear"/>
-          </w:tcPr>
-          <w:p>
+                <w:sz w:val="22"/>
+              </w:rPr>
+              <w:t>Status</w:t>
+            </w:r>
+          </w:p>
+        </w:tc>
+        <w:tc>
+          <w:tcPr>
+            <w:tcW w:w="6750" w:type="dxa"/>
+          </w:tcPr>
+          <w:p>
+            <w:pPr>
+              <w:jc w:val="center"/>
+            </w:pPr>
             <w:r>
               <w:rPr>
                 <w:rFonts w:ascii="Times New Roman" w:hAnsi="Times New Roman"/>
-                <w:sz w:val="14"/>
-              </w:rPr>
-              <w:t xml:space="preserve">1. Select category and product.</w:t>
-            </w:r>
-          </w:p>
-          <w:p>
-            <w:r>
-              <w:rPr>
-                <w:rFonts w:ascii="Times New Roman" w:hAnsi="Times New Roman"/>
-                <w:sz w:val="14"/>
-              </w:rPr>
-              <w:t xml:space="preserve">2. Enter or scan the movement.</w:t>
-            </w:r>
-          </w:p>
-          <w:p>
-            <w:r>
-              <w:rPr>
-                <w:rFonts w:ascii="Times New Roman" w:hAnsi="Times New Roman"/>
-                <w:sz w:val="14"/>
-              </w:rPr>
-              <w:t xml:space="preserve">3. Review quantity and source.</w:t>
-            </w:r>
-          </w:p>
-          <w:p>
-            <w:r>
-              <w:rPr>
-                <w:rFonts w:ascii="Times New Roman" w:hAnsi="Times New Roman"/>
-                <w:sz w:val="14"/>
-              </w:rPr>
-              <w:t xml:space="preserve">4. Confirm the allowed operation.</w:t>
-            </w:r>
-          </w:p>
-        </w:tc>
-        <w:tc>
-          <w:tcPr>
-            <w:tcW w:w="900" w:type="dxa"/>
-            <w:shd w:fill="D6EAF8" w:val="clear"/>
-          </w:tcPr>
-          <w:p>
-            <w:r>
-              <w:rPr>
-                <w:rFonts w:ascii="Times New Roman" w:hAnsi="Times New Roman"/>
-                <w:sz w:val="14"/>
-              </w:rPr>
-              <w:t xml:space="preserve">1. Select product or tier.</w:t>
-            </w:r>
-          </w:p>
-          <w:p>
-            <w:r>
-              <w:rPr>
-                <w:rFonts w:ascii="Times New Roman" w:hAnsi="Times New Roman"/>
-                <w:sz w:val="14"/>
-              </w:rPr>
-              <w:t xml:space="preserve">2. Review quantities, prices and yield.</w:t>
-            </w:r>
-          </w:p>
-          <w:p>
-            <w:r>
-              <w:rPr>
-                <w:rFonts w:ascii="Times New Roman" w:hAnsi="Times New Roman"/>
-                <w:sz w:val="14"/>
-              </w:rPr>
-              <w:t xml:space="preserve">3. Maintain formula lines.</w:t>
-            </w:r>
-          </w:p>
-          <w:p>
-            <w:r>
-              <w:rPr>
-                <w:rFonts w:ascii="Times New Roman" w:hAnsi="Times New Roman"/>
-                <w:sz w:val="14"/>
-              </w:rPr>
-              <w:t xml:space="preserve">4. Review calculated cost and price.</w:t>
-            </w:r>
-          </w:p>
-        </w:tc>
-        <w:tc>
-          <w:tcPr>
-            <w:tcW w:w="900" w:type="dxa"/>
-            <w:shd w:fill="D6EAF8" w:val="clear"/>
-          </w:tcPr>
-          <w:p>
-            <w:r>
-              <w:rPr>
-                <w:rFonts w:ascii="Times New Roman" w:hAnsi="Times New Roman"/>
-                <w:sz w:val="14"/>
-              </w:rPr>
-              <w:t xml:space="preserve">1. Choose preparation tool.</w:t>
-            </w:r>
-          </w:p>
-          <w:p>
-            <w:r>
-              <w:rPr>
-                <w:rFonts w:ascii="Times New Roman" w:hAnsi="Times New Roman"/>
-                <w:sz w:val="14"/>
-              </w:rPr>
-              <w:t xml:space="preserve">2. Upload and review data.</w:t>
-            </w:r>
-          </w:p>
-          <w:p>
-            <w:r>
-              <w:rPr>
-                <w:rFonts w:ascii="Times New Roman" w:hAnsi="Times New Roman"/>
-                <w:sz w:val="14"/>
-              </w:rPr>
-              <w:t xml:space="preserve">3. Run separate PDF/Excel stamper.</w:t>
-            </w:r>
-          </w:p>
-          <w:p>
-            <w:r>
-              <w:rPr>
-                <w:rFonts w:ascii="Times New Roman" w:hAnsi="Times New Roman"/>
-                <w:sz w:val="14"/>
-              </w:rPr>
-              <w:t xml:space="preserve">4. Download results and finalize batch.</w:t>
-            </w:r>
-          </w:p>
-        </w:tc>
-        <w:tc>
-          <w:tcPr>
-            <w:tcW w:w="900" w:type="dxa"/>
-            <w:shd w:fill="D6EAF8" w:val="clear"/>
-          </w:tcPr>
-          <w:p>
-            <w:r>
-              <w:rPr>
-                <w:rFonts w:ascii="Times New Roman" w:hAnsi="Times New Roman"/>
-                <w:sz w:val="14"/>
-              </w:rPr>
-              <w:t xml:space="preserve">1. Scan or type tracking.</w:t>
-            </w:r>
-          </w:p>
-          <w:p>
-            <w:r>
-              <w:rPr>
-                <w:rFonts w:ascii="Times New Roman" w:hAnsi="Times New Roman"/>
-                <w:sz w:val="14"/>
-              </w:rPr>
-              <w:t xml:space="preserve">2. Capture or upload photo.</w:t>
-            </w:r>
-          </w:p>
-          <w:p>
-            <w:r>
-              <w:rPr>
-                <w:rFonts w:ascii="Times New Roman" w:hAnsi="Times New Roman"/>
-                <w:sz w:val="14"/>
-              </w:rPr>
-              <w:t xml:space="preserve">3. Review and save.</w:t>
-            </w:r>
-          </w:p>
-          <w:p>
-            <w:r>
-              <w:rPr>
-                <w:rFonts w:ascii="Times New Roman" w:hAnsi="Times New Roman"/>
-                <w:sz w:val="14"/>
-              </w:rPr>
-              <w:t xml:space="preserve">4. Continue to next record.</w:t>
-            </w:r>
-          </w:p>
-        </w:tc>
-        <w:tc>
-          <w:tcPr>
-            <w:tcW w:w="900" w:type="dxa"/>
-            <w:shd w:fill="D6EAF8" w:val="clear"/>
-          </w:tcPr>
-          <w:p>
-            <w:r>
-              <w:rPr>
-                <w:rFonts w:ascii="Times New Roman" w:hAnsi="Times New Roman"/>
-                <w:sz w:val="14"/>
-              </w:rPr>
-              <w:t xml:space="preserve">1. Record case and condition.</w:t>
-            </w:r>
-          </w:p>
-          <w:p>
-            <w:r>
-              <w:rPr>
-                <w:rFonts w:ascii="Times New Roman" w:hAnsi="Times New Roman"/>
-                <w:sz w:val="14"/>
-              </w:rPr>
-              <w:t xml:space="preserve">2. Open stock-in session.</w:t>
-            </w:r>
-          </w:p>
-          <w:p>
-            <w:r>
-              <w:rPr>
-                <w:rFonts w:ascii="Times New Roman" w:hAnsi="Times New Roman"/>
-                <w:sz w:val="14"/>
-              </w:rPr>
-              <w:t xml:space="preserve">3. Scan received sellable goods.</w:t>
-            </w:r>
-          </w:p>
-          <w:p>
-            <w:r>
-              <w:rPr>
-                <w:rFonts w:ascii="Times New Roman" w:hAnsi="Times New Roman"/>
-                <w:sz w:val="14"/>
-              </w:rPr>
-              <w:t xml:space="preserve">4. Review and confirm session.</w:t>
+                <w:sz w:val="22"/>
+              </w:rPr>
+              <w:t>Ongoing</w:t>
             </w:r>
           </w:p>
         </w:tc>
@@ -6216,92 +5594,29 @@
       <w:tr>
         <w:tc>
           <w:tcPr>
-            <w:tcW w:w="900" w:type="dxa"/>
-            <w:shd w:fill="FFFFFF" w:val="clear"/>
+            <w:tcW w:w="2250" w:type="dxa"/>
           </w:tcPr>
           <w:p>
             <w:r>
               <w:rPr>
                 <w:rFonts w:ascii="Times New Roman" w:hAnsi="Times New Roman"/>
-                <w:sz w:val="14"/>
                 <w:b/>
-              </w:rPr>
-              <w:t xml:space="preserve">Postcondition</w:t>
-            </w:r>
-          </w:p>
-        </w:tc>
-        <w:tc>
-          <w:tcPr>
-            <w:tcW w:w="900" w:type="dxa"/>
-            <w:shd w:fill="FFFFFF" w:val="clear"/>
-          </w:tcPr>
-          <w:p>
-            <w:r>
-              <w:rPr>
-                <w:rFonts w:ascii="Times New Roman" w:hAnsi="Times New Roman"/>
-                <w:sz w:val="14"/>
-              </w:rPr>
-              <w:t xml:space="preserve">The relevant balance and movement record reflect the confirmed quantity.</w:t>
-            </w:r>
-          </w:p>
-        </w:tc>
-        <w:tc>
-          <w:tcPr>
-            <w:tcW w:w="900" w:type="dxa"/>
-            <w:shd w:fill="FFFFFF" w:val="clear"/>
-          </w:tcPr>
-          <w:p>
-            <w:r>
-              <w:rPr>
-                <w:rFonts w:ascii="Times New Roman" w:hAnsi="Times New Roman"/>
-                <w:sz w:val="14"/>
-              </w:rPr>
-              <w:t xml:space="preserve">The cost is reproducible from the stored inputs.</w:t>
-            </w:r>
-          </w:p>
-        </w:tc>
-        <w:tc>
-          <w:tcPr>
-            <w:tcW w:w="900" w:type="dxa"/>
-            <w:shd w:fill="FFFFFF" w:val="clear"/>
-          </w:tcPr>
-          <w:p>
-            <w:r>
-              <w:rPr>
-                <w:rFonts w:ascii="Times New Roman" w:hAnsi="Times New Roman"/>
-                <w:sz w:val="14"/>
-              </w:rPr>
-              <w:t xml:space="preserve">Prepared outputs and finalized order/parcel records are available.</w:t>
-            </w:r>
-          </w:p>
-        </w:tc>
-        <w:tc>
-          <w:tcPr>
-            <w:tcW w:w="900" w:type="dxa"/>
-            <w:shd w:fill="FFFFFF" w:val="clear"/>
-          </w:tcPr>
-          <w:p>
-            <w:r>
-              <w:rPr>
-                <w:rFonts w:ascii="Times New Roman" w:hAnsi="Times New Roman"/>
-                <w:sz w:val="14"/>
-              </w:rPr>
-              <w:t xml:space="preserve">Photo is retrievable by tracking number; stock is unchanged.</w:t>
-            </w:r>
-          </w:p>
-        </w:tc>
-        <w:tc>
-          <w:tcPr>
-            <w:tcW w:w="900" w:type="dxa"/>
-            <w:shd w:fill="FFFFFF" w:val="clear"/>
-          </w:tcPr>
-          <w:p>
-            <w:r>
-              <w:rPr>
-                <w:rFonts w:ascii="Times New Roman" w:hAnsi="Times New Roman"/>
-                <w:sz w:val="14"/>
-              </w:rPr>
-              <w:t xml:space="preserve">Case history is retained; confirmed sellable quantity is credited once.</w:t>
+                <w:sz w:val="22"/>
+              </w:rPr>
+              <w:t>Primary Actor</w:t>
+            </w:r>
+          </w:p>
+        </w:tc>
+        <w:tc>
+          <w:tcPr>
+            <w:tcW w:w="6750" w:type="dxa"/>
+          </w:tcPr>
+          <w:p>
+            <w:r>
+              <w:t xml:space="preserve">Admin/Executive, who oversees all six </w:t>
+            </w:r>
+            <w:r>
+              <w:t>modules, maintains product costing and selling prices, and may authorize Mobile POS staff assignments.</w:t>
             </w:r>
           </w:p>
         </w:tc>
@@ -6309,92 +5624,333 @@
       <w:tr>
         <w:tc>
           <w:tcPr>
-            <w:tcW w:w="900" w:type="dxa"/>
-            <w:shd w:fill="D6EAF8" w:val="clear"/>
+            <w:tcW w:w="2250" w:type="dxa"/>
           </w:tcPr>
           <w:p>
             <w:r>
               <w:rPr>
                 <w:rFonts w:ascii="Times New Roman" w:hAnsi="Times New Roman"/>
-                <w:sz w:val="14"/>
                 <w:b/>
-              </w:rPr>
-              <w:t xml:space="preserve">Exceptions</w:t>
-            </w:r>
-          </w:p>
-        </w:tc>
-        <w:tc>
-          <w:tcPr>
-            <w:tcW w:w="900" w:type="dxa"/>
-            <w:shd w:fill="D6EAF8" w:val="clear"/>
+                <w:sz w:val="22"/>
+              </w:rPr>
+              <w:t>Secondary Actor</w:t>
+            </w:r>
+          </w:p>
+        </w:tc>
+        <w:tc>
+          <w:tcPr>
+            <w:tcW w:w="6750" w:type="dxa"/>
+          </w:tcPr>
+          <w:p>
+            <w:r>
+              <w:t xml:space="preserve">Staff, who can access the inventory, order-processing, parcel-processing, Point of Sale (web or </w:t>
+            </w:r>
+            <w:r>
+              <w:lastRenderedPageBreak/>
+              <w:t xml:space="preserve">Mobile POS), and RTS features according </w:t>
+            </w:r>
+            <w:r>
+              <w:t>to role permissions.</w:t>
+            </w:r>
+          </w:p>
+        </w:tc>
+      </w:tr>
+      <w:tr>
+        <w:tc>
+          <w:tcPr>
+            <w:tcW w:w="2250" w:type="dxa"/>
           </w:tcPr>
           <w:p>
             <w:r>
               <w:rPr>
                 <w:rFonts w:ascii="Times New Roman" w:hAnsi="Times New Roman"/>
-                <w:sz w:val="14"/>
-              </w:rPr>
-              <w:t xml:space="preserve">Reject invalid input; preserve balances when an unconfirmed action is cancelled.</w:t>
-            </w:r>
-          </w:p>
-        </w:tc>
-        <w:tc>
-          <w:tcPr>
-            <w:tcW w:w="900" w:type="dxa"/>
-            <w:shd w:fill="D6EAF8" w:val="clear"/>
-          </w:tcPr>
-          <w:p>
+                <w:b/>
+                <w:sz w:val="22"/>
+              </w:rPr>
+              <w:t>Precondition</w:t>
+            </w:r>
+          </w:p>
+        </w:tc>
+        <w:tc>
+          <w:tcPr>
+            <w:tcW w:w="6750" w:type="dxa"/>
+          </w:tcPr>
+          <w:p>
+            <w:pPr>
+              <w:jc w:val="center"/>
+            </w:pPr>
             <w:r>
               <w:rPr>
                 <w:rFonts w:ascii="Times New Roman" w:hAnsi="Times New Roman"/>
-                <w:sz w:val="14"/>
-              </w:rPr>
-              <w:t xml:space="preserve">Deny non-executive access; identify missing configuration before relying on the result.</w:t>
-            </w:r>
-          </w:p>
-        </w:tc>
-        <w:tc>
-          <w:tcPr>
-            <w:tcW w:w="900" w:type="dxa"/>
-            <w:shd w:fill="D6EAF8" w:val="clear"/>
+                <w:sz w:val="22"/>
+              </w:rPr>
+              <w:t>The development team must set up the application, database, and required user accounts before use.</w:t>
+            </w:r>
+          </w:p>
+        </w:tc>
+      </w:tr>
+      <w:tr>
+        <w:tc>
+          <w:tcPr>
+            <w:tcW w:w="2250" w:type="dxa"/>
           </w:tcPr>
           <w:p>
             <w:r>
               <w:rPr>
                 <w:rFonts w:ascii="Times New Roman" w:hAnsi="Times New Roman"/>
-                <w:sz w:val="14"/>
-              </w:rPr>
-              <w:t xml:space="preserve">Report duplicates, unmatched records or missing fields; do not describe partial preparation as finalization.</w:t>
-            </w:r>
-          </w:p>
-        </w:tc>
-        <w:tc>
-          <w:tcPr>
-            <w:tcW w:w="900" w:type="dxa"/>
-            <w:shd w:fill="D6EAF8" w:val="clear"/>
-          </w:tcPr>
-          <w:p>
+                <w:b/>
+                <w:sz w:val="22"/>
+              </w:rPr>
+              <w:t>&lt;Dynamic Precondition&gt;</w:t>
+            </w:r>
+          </w:p>
+        </w:tc>
+        <w:tc>
+          <w:tcPr>
+            <w:tcW w:w="6750" w:type="dxa"/>
+          </w:tcPr>
+          <w:p>
+            <w:pPr>
+              <w:jc w:val="center"/>
+            </w:pPr>
             <w:r>
               <w:rPr>
                 <w:rFonts w:ascii="Times New Roman" w:hAnsi="Times New Roman"/>
-                <w:sz w:val="14"/>
-              </w:rPr>
-              <w:t xml:space="preserve">Provide duplicate feedback and request valid image/tracking input. A CSR parcel is not required.</w:t>
-            </w:r>
-          </w:p>
-        </w:tc>
-        <w:tc>
-          <w:tcPr>
-            <w:tcW w:w="900" w:type="dxa"/>
-            <w:shd w:fill="D6EAF8" w:val="clear"/>
+                <w:sz w:val="22"/>
+              </w:rPr>
+              <w:t>Admin/Executive and Staff must familiarize themselves with their assigned modules and role-based permissions before performing operations.</w:t>
+            </w:r>
+          </w:p>
+        </w:tc>
+      </w:tr>
+      <w:tr>
+        <w:tc>
+          <w:tcPr>
+            <w:tcW w:w="2250" w:type="dxa"/>
           </w:tcPr>
           <w:p>
             <w:r>
               <w:rPr>
                 <w:rFonts w:ascii="Times New Roman" w:hAnsi="Times New Roman"/>
-                <w:sz w:val="14"/>
-              </w:rPr>
-              <w:t xml:space="preserve">Case save alone adds no sellable stock; discarding a draft leaves inventory unchanged.</w:t>
+                <w:b/>
+                <w:sz w:val="22"/>
+              </w:rPr>
+              <w:t>Assumptions</w:t>
+            </w:r>
+          </w:p>
+        </w:tc>
+        <w:tc>
+          <w:tcPr>
+            <w:tcW w:w="6750" w:type="dxa"/>
+          </w:tcPr>
+          <w:p>
+            <w:r>
+              <w:t>All dynamic preconditions are met and the six connected modules — Inventory, Costing, Order Processing, Parcel Processing, and RTS — are configured and running without errors.</w:t>
+            </w:r>
+          </w:p>
+        </w:tc>
+      </w:tr>
+      <w:tr>
+        <w:tc>
+          <w:tcPr>
+            <w:tcW w:w="2250" w:type="dxa"/>
+          </w:tcPr>
+          <w:p>
+            <w:r>
+              <w:rPr>
+                <w:rFonts w:ascii="Times New Roman" w:hAnsi="Times New Roman"/>
+                <w:b/>
+                <w:sz w:val="22"/>
+              </w:rPr>
+              <w:t>Trigger</w:t>
+            </w:r>
+          </w:p>
+        </w:tc>
+        <w:tc>
+          <w:tcPr>
+            <w:tcW w:w="6750" w:type="dxa"/>
+          </w:tcPr>
+          <w:p>
+            <w:pPr>
+              <w:jc w:val="center"/>
+            </w:pPr>
+            <w:r>
+              <w:rPr>
+                <w:rFonts w:ascii="Times New Roman" w:hAnsi="Times New Roman"/>
+                <w:sz w:val="22"/>
+              </w:rPr>
+              <w:t>When Admin/Executive creates and assigns Staff accounts, or when a user logs in to perform an assigned inventory, order, parcel, or return task.</w:t>
+            </w:r>
+          </w:p>
+        </w:tc>
+      </w:tr>
+      <w:tr>
+        <w:tc>
+          <w:tcPr>
+            <w:tcW w:w="2250" w:type="dxa"/>
+          </w:tcPr>
+          <w:p>
+            <w:r>
+              <w:rPr>
+                <w:rFonts w:ascii="Times New Roman" w:hAnsi="Times New Roman"/>
+                <w:b/>
+                <w:sz w:val="22"/>
+              </w:rPr>
+              <w:t>Success Post Condition</w:t>
+            </w:r>
+          </w:p>
+        </w:tc>
+        <w:tc>
+          <w:tcPr>
+            <w:tcW w:w="6750" w:type="dxa"/>
+          </w:tcPr>
+          <w:p>
+            <w:pPr>
+              <w:jc w:val="center"/>
+            </w:pPr>
+            <w:r>
+              <w:rPr>
+                <w:rFonts w:ascii="Times New Roman" w:hAnsi="Times New Roman"/>
+                <w:sz w:val="22"/>
+              </w:rPr>
+              <w:t>After login, the functions and features of each module run successfully according to the user's assigned role and permissions, and the relevant records are updated accurately.</w:t>
+            </w:r>
+          </w:p>
+        </w:tc>
+      </w:tr>
+      <w:tr>
+        <w:tc>
+          <w:tcPr>
+            <w:tcW w:w="2250" w:type="dxa"/>
+          </w:tcPr>
+          <w:p>
+            <w:r>
+              <w:rPr>
+                <w:rFonts w:ascii="Times New Roman" w:hAnsi="Times New Roman"/>
+                <w:b/>
+                <w:sz w:val="22"/>
+              </w:rPr>
+              <w:t>Failed Condition</w:t>
+            </w:r>
+          </w:p>
+        </w:tc>
+        <w:tc>
+          <w:tcPr>
+            <w:tcW w:w="6750" w:type="dxa"/>
+          </w:tcPr>
+          <w:p>
+            <w:pPr>
+              <w:jc w:val="center"/>
+            </w:pPr>
+            <w:r>
+              <w:rPr>
+                <w:rFonts w:ascii="Times New Roman" w:hAnsi="Times New Roman"/>
+                <w:sz w:val="22"/>
+              </w:rPr>
+              <w:t>A module fails to load, a stock or order record is not updated correctly, or role-based access restrictions are not properly enforced.</w:t>
+            </w:r>
+          </w:p>
+        </w:tc>
+      </w:tr>
+      <w:tr>
+        <w:tc>
+          <w:tcPr>
+            <w:tcW w:w="2250" w:type="dxa"/>
+          </w:tcPr>
+          <w:p>
+            <w:r>
+              <w:rPr>
+                <w:rFonts w:ascii="Times New Roman" w:hAnsi="Times New Roman"/>
+                <w:b/>
+                <w:sz w:val="22"/>
+              </w:rPr>
+              <w:t>Model</w:t>
+            </w:r>
+          </w:p>
+        </w:tc>
+        <w:tc>
+          <w:tcPr>
+            <w:tcW w:w="6750" w:type="dxa"/>
+          </w:tcPr>
+          <w:p>
+            <w:pPr>
+              <w:jc w:val="center"/>
+            </w:pPr>
+            <w:r>
+              <w:rPr>
+                <w:rFonts w:ascii="Times New Roman" w:hAnsi="Times New Roman"/>
+                <w:sz w:val="22"/>
+              </w:rPr>
+              <w:t>Use Case Matrix</w:t>
+            </w:r>
+          </w:p>
+        </w:tc>
+      </w:tr>
+      <w:tr>
+        <w:tc>
+          <w:tcPr>
+            <w:tcW w:w="2250" w:type="dxa"/>
+          </w:tcPr>
+          <w:p>
+            <w:r>
+              <w:rPr>
+                <w:rFonts w:ascii="Times New Roman" w:hAnsi="Times New Roman"/>
+                <w:b/>
+                <w:sz w:val="22"/>
+              </w:rPr>
+              <w:lastRenderedPageBreak/>
+              <w:t>Operation Concepts</w:t>
+            </w:r>
+          </w:p>
+        </w:tc>
+        <w:tc>
+          <w:tcPr>
+            <w:tcW w:w="6750" w:type="dxa"/>
+          </w:tcPr>
+          <w:p>
+            <w:pPr>
+              <w:jc w:val="center"/>
+            </w:pPr>
+            <w:r>
+              <w:rPr>
+                <w:rFonts w:ascii="Times New Roman" w:hAnsi="Times New Roman"/>
+                <w:sz w:val="22"/>
+              </w:rPr>
+              <w:t>Each module must run according to its intended purpose, connecting inventory, costing, order processing, parcel documentation, and RTS management into a single operational record. The functions help Pyx Food Products reduce manual recordkeeping and maintain traceability from receipt to fulfillment or return.</w:t>
+            </w:r>
+          </w:p>
+        </w:tc>
+      </w:tr>
+      <w:tr>
+        <w:tc>
+          <w:tcPr>
+            <w:tcW w:w="2250" w:type="dxa"/>
+          </w:tcPr>
+          <w:p>
+            <w:r>
+              <w:rPr>
+                <w:rFonts w:ascii="Times New Roman" w:hAnsi="Times New Roman"/>
+                <w:b/>
+                <w:sz w:val="22"/>
+              </w:rPr>
+              <w:t>Overview</w:t>
+            </w:r>
+          </w:p>
+        </w:tc>
+        <w:tc>
+          <w:tcPr>
+            <w:tcW w:w="6750" w:type="dxa"/>
+          </w:tcPr>
+          <w:p>
+            <w:pPr>
+              <w:jc w:val="center"/>
+            </w:pPr>
+            <w:r>
+              <w:rPr>
+                <w:rFonts w:ascii="Times New Roman" w:hAnsi="Times New Roman"/>
+                <w:sz w:val="22"/>
+              </w:rPr>
+              <w:t>The system integrates five connected modules to give Admin/Executive and Staff a shared, accurate view of company operations. Reliable results depend on completed configuration — correct starting balances, formulas, prices, and mappings — before each module is used.</w:t>
             </w:r>
           </w:p>
         </w:tc>
@@ -6413,128 +5969,57 @@
         <w:ind w:firstLine="0"/>
         <w:jc w:val="center"/>
       </w:pPr>
-      <w:r>
-        <w:rPr>
-          <w:sz w:val="22"/>
-        </w:rPr>
-      </w:r>
-      <w:proofErr w:type="gramStart"/>
-      <w:r>
-        <w:rPr>
-          <w:sz w:val="22"/>
-        </w:rPr>
-      </w:r>
-      <w:proofErr w:type="gramEnd"/>
-      <w:r>
-        <w:rPr>
-          <w:sz w:val="22"/>
-        </w:rPr>
-      </w:r>
     </w:p>
     <w:p>
       <w:pPr>
-        <w:spacing w:after="60" w:line="240" w:lineRule="auto"/>
-        <w:ind w:firstLine="0"/>
+        <w:pStyle w:val="CapHeading3"/>
+      </w:pPr>
+      <w:bookmarkStart w:id="34" w:name="_Toc240539001"/>
+    </w:p>
+    <w:p>
+      <w:pPr>
+        <w:pStyle w:val="CapHeading3"/>
       </w:pPr>
     </w:p>
     <w:p>
       <w:pPr>
-        <w:keepNext/>
-        <w:spacing w:line="276" w:lineRule="auto"/>
-        <w:ind w:firstLine="0"/>
-        <w:jc w:val="center"/>
-      </w:pPr>
-      <w:r>
-        <w:rPr>
-          <w:sz w:val="22"/>
-        </w:rPr>
-      </w:r>
-      <w:proofErr w:type="gramStart"/>
-      <w:r>
-        <w:rPr>
-          <w:sz w:val="22"/>
-        </w:rPr>
-      </w:r>
-      <w:proofErr w:type="gramEnd"/>
-      <w:r>
-        <w:rPr>
-          <w:sz w:val="22"/>
-        </w:rPr>
-      </w:r>
-    </w:p>
-    <w:p>
-      <w:pPr>
-        <w:spacing w:after="60" w:line="240" w:lineRule="auto"/>
-        <w:ind w:firstLine="0"/>
+        <w:pStyle w:val="CapHeading3"/>
       </w:pPr>
     </w:p>
     <w:p>
       <w:pPr>
-        <w:keepNext/>
-        <w:spacing w:line="276" w:lineRule="auto"/>
-        <w:ind w:firstLine="0"/>
-        <w:jc w:val="center"/>
-      </w:pPr>
-      <w:r>
-        <w:rPr>
-          <w:sz w:val="22"/>
-        </w:rPr>
-      </w:r>
-      <w:proofErr w:type="gramStart"/>
-      <w:r>
-        <w:rPr>
-          <w:sz w:val="22"/>
-        </w:rPr>
-      </w:r>
-      <w:proofErr w:type="gramEnd"/>
-      <w:r>
-        <w:rPr>
-          <w:sz w:val="22"/>
-        </w:rPr>
-      </w:r>
-    </w:p>
-    <w:p>
-      <w:pPr>
-        <w:spacing w:after="60" w:line="240" w:lineRule="auto"/>
-        <w:ind w:firstLine="0"/>
+        <w:pStyle w:val="CapHeading3"/>
       </w:pPr>
     </w:p>
     <w:p>
       <w:pPr>
-        <w:keepNext/>
-        <w:spacing w:line="276" w:lineRule="auto"/>
-        <w:ind w:firstLine="0"/>
-        <w:jc w:val="center"/>
-      </w:pPr>
-      <w:r>
-        <w:rPr>
-          <w:sz w:val="22"/>
-        </w:rPr>
-      </w:r>
-      <w:proofErr w:type="gramStart"/>
-      <w:r>
-        <w:rPr>
-          <w:sz w:val="22"/>
-        </w:rPr>
-      </w:r>
-      <w:proofErr w:type="gramEnd"/>
-      <w:r>
-        <w:rPr>
-          <w:sz w:val="22"/>
-        </w:rPr>
-      </w:r>
-    </w:p>
-    <w:p>
-      <w:pPr>
-        <w:spacing w:after="60" w:line="240" w:lineRule="auto"/>
-        <w:ind w:firstLine="0"/>
+        <w:pStyle w:val="CapHeading3"/>
       </w:pPr>
     </w:p>
     <w:p>
       <w:pPr>
-        <w:pStyle w:val="Heading3"/>
+        <w:pStyle w:val="CapHeading3"/>
       </w:pPr>
-      <w:bookmarkStart w:id="34" w:name="_Toc240539001"/>
+    </w:p>
+    <w:p>
+      <w:pPr>
+        <w:pStyle w:val="CapHeading3"/>
+      </w:pPr>
+    </w:p>
+    <w:p>
+      <w:pPr>
+        <w:pStyle w:val="CapHeading3"/>
+      </w:pPr>
+    </w:p>
+    <w:p>
+      <w:pPr>
+        <w:pStyle w:val="CapHeading3"/>
+      </w:pPr>
+    </w:p>
+    <w:p>
+      <w:pPr>
+        <w:pStyle w:val="CapHeading3"/>
+      </w:pPr>
       <w:r>
         <w:t>Storyboard</w:t>
       </w:r>
@@ -6545,11 +6030,7 @@
         <w:jc w:val="both"/>
       </w:pPr>
       <w:r>
-        <w:t xml:space="preserve">The following labeled wireframes explain the principal screens and interaction sequences. They are schematic drawings, not production screenshots. </w:t>
-      </w:r>
-      <w:r>
-        <w:lastRenderedPageBreak/>
-        <w:t>They follow the reference's screen-plus-explanation approach without copying its sample company's interface. Approved screenshots of the exact evaluated release can replace them if deployed-screen evidence is required.</w:t>
+        <w:t>The following storyboards present one screen per figure in the institutional sample format (screen title, interface image, and module description). Admin/Executive screens use the Pyx Tracker web system; Staff screens use the Pyx POS terminal.</w:t>
       </w:r>
     </w:p>
     <w:p>
@@ -6563,8 +6044,9 @@
         <w:rPr>
           <w:noProof/>
         </w:rPr>
+        <w:lastRenderedPageBreak/>
         <w:drawing>
-          <wp:inline distT="0" distB="0" distL="0" distR="0" wp14:anchorId="3509BDC1" wp14:editId="51C16224">
+          <wp:inline distT="0" distB="0" distL="0" distR="0" wp14:anchorId="29905675" wp14:editId="21518838">
             <wp:extent cx="5486400" cy="3444240"/>
             <wp:effectExtent l="0" t="0" r="0" b="0"/>
             <wp:docPr id="8" name="Picture 8"/>
@@ -6610,21 +6092,21 @@
         <w:rPr>
           <w:sz w:val="22"/>
         </w:rPr>
-        <w:t xml:space="preserve">Figure </w:t>
+        <w:t xml:space="preserve">Figure 3.6  Executive Login Page of Pyx Tracker</w:t>
       </w:r>
       <w:proofErr w:type="gramStart"/>
       <w:r>
         <w:rPr>
           <w:sz w:val="22"/>
         </w:rPr>
-        <w:t>3.6  Inventory</w:t>
+        <w:t/>
       </w:r>
       <w:proofErr w:type="gramEnd"/>
       <w:r>
         <w:rPr>
           <w:sz w:val="22"/>
         </w:rPr>
-        <w:t xml:space="preserve"> Storyboard</w:t>
+        <w:t xml:space="preserve"/>
       </w:r>
     </w:p>
     <w:p>
@@ -6632,7 +6114,7 @@
         <w:jc w:val="both"/>
       </w:pPr>
       <w:r>
-        <w:t>The user selects the category, product, and lot, enters or scans the movement, and reviews the action before confirmation. Quantities use the selected stock type's units. Available actions depend on the user's permissions.</w:t>
+        <w:t>The Executive opens Pyx Tracker Management System and signs in with an assigned username and password. Successful authentication routes the Executive to the role-based dashboard with full management navigation.</w:t>
       </w:r>
     </w:p>
     <w:p>
@@ -6648,7 +6130,7 @@
         </w:rPr>
         <w:lastRenderedPageBreak/>
         <w:drawing>
-          <wp:inline distT="0" distB="0" distL="0" distR="0" wp14:anchorId="02DECE6E" wp14:editId="38A21326">
+          <wp:inline distT="0" distB="0" distL="0" distR="0" wp14:anchorId="4FE38B48" wp14:editId="6763392C">
             <wp:extent cx="5486400" cy="3444240"/>
             <wp:effectExtent l="0" t="0" r="0" b="0"/>
             <wp:docPr id="9" name="Picture 9"/>
@@ -6694,21 +6176,21 @@
         <w:rPr>
           <w:sz w:val="22"/>
         </w:rPr>
-        <w:t xml:space="preserve">Figure </w:t>
+        <w:t xml:space="preserve">Figure 3.7  Executive Inventory Warehouse of Pyx Tracker</w:t>
       </w:r>
       <w:proofErr w:type="gramStart"/>
       <w:r>
         <w:rPr>
           <w:sz w:val="22"/>
         </w:rPr>
-        <w:t>3.7  Online</w:t>
+        <w:t/>
       </w:r>
       <w:proofErr w:type="gramEnd"/>
       <w:r>
         <w:rPr>
           <w:sz w:val="22"/>
         </w:rPr>
-        <w:t xml:space="preserve"> Orders Storyboard</w:t>
+        <w:t xml:space="preserve"/>
       </w:r>
     </w:p>
     <w:p>
@@ -6716,7 +6198,7 @@
         <w:jc w:val="both"/>
       </w:pPr>
       <w:r>
-        <w:t>Staff select a source-specific preparation tool, review the information, then operate the separate stamper. Generated documents and finalized batch records are distinct outcomes.</w:t>
+        <w:t>With an EXECUTIVE badge, the user manages Raw Honey warehouse stock-in and stock-out to production, reviews supplier lots, quantities, and availability, and can edit or stock out selected rows.</w:t>
       </w:r>
     </w:p>
     <w:p>
@@ -6732,7 +6214,7 @@
         </w:rPr>
         <w:lastRenderedPageBreak/>
         <w:drawing>
-          <wp:inline distT="0" distB="0" distL="0" distR="0" wp14:anchorId="3CC573B2" wp14:editId="7DF44ACD">
+          <wp:inline distT="0" distB="0" distL="0" distR="0" wp14:anchorId="64953C07" wp14:editId="4C2CB9B9">
             <wp:extent cx="5486400" cy="3444240"/>
             <wp:effectExtent l="0" t="0" r="0" b="0"/>
             <wp:docPr id="10" name="Picture 10"/>
@@ -6778,21 +6260,21 @@
         <w:rPr>
           <w:sz w:val="22"/>
         </w:rPr>
-        <w:t xml:space="preserve">Figure </w:t>
+        <w:t xml:space="preserve">Figure 3.8  Executive Product Costing of Pyx Tracker</w:t>
       </w:r>
       <w:proofErr w:type="gramStart"/>
       <w:r>
         <w:rPr>
           <w:sz w:val="22"/>
         </w:rPr>
-        <w:t>3.8  Product</w:t>
+        <w:t/>
       </w:r>
       <w:proofErr w:type="gramEnd"/>
       <w:r>
         <w:rPr>
           <w:sz w:val="22"/>
         </w:rPr>
-        <w:t xml:space="preserve"> Costing Storyboard</w:t>
+        <w:t xml:space="preserve"/>
       </w:r>
     </w:p>
     <w:p>
@@ -6800,7 +6282,7 @@
         <w:jc w:val="both"/>
       </w:pPr>
       <w:r>
-        <w:t>Admin/Executive selects a product or parcel recipe, checks price and yield, and reviews formula or custom-cost lines. Product and parcel expenses remain separate.</w:t>
+        <w:t>The Executive reviews manufacturing COGS, parcel packaging cost, landed cost, sell price, and margin by product department and size. This costing hub is for Executive pricing decisions and is not used by Staff cashiers.</w:t>
       </w:r>
     </w:p>
     <w:p>
@@ -6816,7 +6298,7 @@
         </w:rPr>
         <w:lastRenderedPageBreak/>
         <w:drawing>
-          <wp:inline distT="0" distB="0" distL="0" distR="0" wp14:anchorId="1FE6A431" wp14:editId="6E35C03E">
+          <wp:inline distT="0" distB="0" distL="0" distR="0" wp14:anchorId="6ADDDE99" wp14:editId="5CB17F1A">
             <wp:extent cx="5486400" cy="3444240"/>
             <wp:effectExtent l="0" t="0" r="0" b="0"/>
             <wp:docPr id="11" name="Picture 11"/>
@@ -6862,21 +6344,21 @@
         <w:rPr>
           <w:sz w:val="22"/>
         </w:rPr>
-        <w:t xml:space="preserve">Figure </w:t>
+        <w:t xml:space="preserve">Figure 3.9  Executive Online Orders of Pyx Tracker</w:t>
       </w:r>
       <w:proofErr w:type="gramStart"/>
       <w:r>
         <w:rPr>
           <w:sz w:val="22"/>
         </w:rPr>
-        <w:t>3.9  Parcel</w:t>
+        <w:t/>
       </w:r>
       <w:proofErr w:type="gramEnd"/>
       <w:r>
         <w:rPr>
           <w:sz w:val="22"/>
         </w:rPr>
-        <w:t xml:space="preserve"> Documentation Storyboard</w:t>
+        <w:t xml:space="preserve"/>
       </w:r>
     </w:p>
     <w:p>
@@ -6884,7 +6366,7 @@
         <w:jc w:val="both"/>
       </w:pPr>
       <w:r>
-        <w:t>The operator enters the tracking number, captures or uploads the image, and saves the photo record. The storyboard does not depict stock deduction from this documentary action.</w:t>
+        <w:t>The Executive prepares multi-platform order Excel files using VIP and Shopee tools, validates workbooks, then stamps waybill PDFs into the active batch for fulfillment.</w:t>
       </w:r>
     </w:p>
     <w:p>
@@ -6900,7 +6382,7 @@
         </w:rPr>
         <w:lastRenderedPageBreak/>
         <w:drawing>
-          <wp:inline distT="0" distB="0" distL="0" distR="0" wp14:anchorId="1F1CFF90" wp14:editId="368506AA">
+          <wp:inline distT="0" distB="0" distL="0" distR="0" wp14:anchorId="2065FB76" wp14:editId="036CB0BE">
             <wp:extent cx="5486400" cy="3444240"/>
             <wp:effectExtent l="0" t="0" r="0" b="0"/>
             <wp:docPr id="12" name="Picture 12"/>
@@ -6946,21 +6428,21 @@
         <w:rPr>
           <w:sz w:val="22"/>
         </w:rPr>
-        <w:t xml:space="preserve">Figure </w:t>
+        <w:t xml:space="preserve">Figure 3.10  Staff POS Login Page of Pyx Tracker</w:t>
       </w:r>
       <w:proofErr w:type="gramStart"/>
       <w:r>
         <w:rPr>
           <w:sz w:val="22"/>
         </w:rPr>
-        <w:t>3.10  Return</w:t>
+        <w:t/>
       </w:r>
       <w:proofErr w:type="gramEnd"/>
       <w:r>
         <w:rPr>
           <w:sz w:val="22"/>
         </w:rPr>
-        <w:t>-to-Sender Storyboard</w:t>
+        <w:t/>
       </w:r>
     </w:p>
     <w:p>
@@ -6968,12 +6450,12 @@
         <w:jc w:val="both"/>
       </w:pPr>
       <w:r>
-        <w:t>The operator records the case and condition, then reviews a separate stock-in session for received sellable units. Inventory is credited after confirmation.</w:t>
+        <w:t>Staff open the Pyx POS staff terminal and enter an Employee ID assigned in Settings. Only authorized executives and staff can open the POS app for walk-in sales.</w:t>
       </w:r>
     </w:p>
     <w:p>
       <w:pPr>
-        <w:pStyle w:val="Heading3"/>
+        <w:pStyle w:val="CapHeading3"/>
       </w:pPr>
       <w:bookmarkStart w:id="35" w:name="_Toc240539002"/>
       <w:r>
@@ -6994,7 +6476,7 @@
           <w:noProof/>
         </w:rPr>
         <w:drawing>
-          <wp:inline distT="0" distB="0" distL="0" distR="0" wp14:anchorId="285D68F2" wp14:editId="228FE6CE">
+          <wp:inline distT="0" distB="0" distL="0" distR="0" wp14:anchorId="7BC51873" wp14:editId="5347F328">
             <wp:extent cx="5486400" cy="3962400"/>
             <wp:effectExtent l="0" t="0" r="0" b="0"/>
             <wp:docPr id="13" name="Picture 13"/>
@@ -7054,34 +6536,44 @@
         <w:rPr>
           <w:sz w:val="22"/>
         </w:rPr>
-        <w:t xml:space="preserve"> Design by Functional Area</w:t>
+        <w:t xml:space="preserve"> Design of Pyx Tracker</w:t>
       </w:r>
     </w:p>
     <w:p>
       <w:pPr>
-        <w:jc w:val="both"/>
+        <w:pStyle w:val="CapHeading3"/>
       </w:pPr>
-      <w:r>
-        <w:t>The shared relational database contains identity, stock, production, order, costing, and returns records. The areas shown are logical groupings, not independent databases. Dedicated tables preserve the different units and lifecycles of honey stages, department goods, material pools, and transactions.</w:t>
-      </w:r>
+      <w:bookmarkStart w:id="36" w:name="_Toc240539003"/>
     </w:p>
     <w:p>
       <w:pPr>
-        <w:jc w:val="both"/>
+        <w:pStyle w:val="CapHeading3"/>
       </w:pPr>
-      <w:r>
-        <w:t xml:space="preserve">Column and foreign-key metadata were inspected on 15 September 2026. Business records were not needed. Figure 3.12 describes the reviewed local </w:t>
-      </w:r>
-      <w:r>
-        <w:lastRenderedPageBreak/>
-        <w:t>schema in one Entity Relationship Diagram; deployment environments may add operational columns over time.</w:t>
-      </w:r>
     </w:p>
     <w:p>
       <w:pPr>
-        <w:pStyle w:val="Heading3"/>
+        <w:pStyle w:val="CapHeading3"/>
       </w:pPr>
-      <w:bookmarkStart w:id="36" w:name="_Toc240539003"/>
+    </w:p>
+    <w:p>
+      <w:pPr>
+        <w:pStyle w:val="CapHeading3"/>
+      </w:pPr>
+    </w:p>
+    <w:p>
+      <w:pPr>
+        <w:pStyle w:val="CapHeading3"/>
+      </w:pPr>
+    </w:p>
+    <w:p>
+      <w:pPr>
+        <w:pStyle w:val="CapHeading3"/>
+      </w:pPr>
+    </w:p>
+    <w:p>
+      <w:pPr>
+        <w:pStyle w:val="CapHeading3"/>
+      </w:pPr>
       <w:r>
         <w:t>Entity Relationship Diagram</w:t>
       </w:r>
@@ -7101,7 +6593,7 @@
         </w:rPr>
         <w:lastRenderedPageBreak/>
         <w:drawing>
-          <wp:inline distT="0" distB="0" distL="0" distR="0" wp14:anchorId="05962CFA" wp14:editId="6D4838E0">
+          <wp:inline distT="0" distB="0" distL="0" distR="0" wp14:anchorId="0A481748" wp14:editId="0AB1DF28">
             <wp:extent cx="5486400" cy="4239490"/>
             <wp:effectExtent l="0" t="0" r="0" b="0"/>
             <wp:docPr id="14" name="Picture 14"/>
@@ -7157,33 +6649,7 @@
     </w:p>
     <w:p>
       <w:pPr>
-        <w:spacing w:after="160" w:line="276" w:lineRule="auto"/>
-        <w:ind w:firstLine="0"/>
-        <w:jc w:val="center"/>
-      </w:pPr>
-      <w:r>
-        <w:t>Figure 3.12 presents the single Entity Relationship Diagram of Pyx Tracker derived from the project SQL schema (</w:t>
-      </w:r>
-      <w:proofErr w:type="spellStart"/>
-      <w:r>
-        <w:t>full_schema.sql</w:t>
-      </w:r>
-      <w:proofErr w:type="spellEnd"/>
-      <w:r>
-        <w:t xml:space="preserve">, applied migrations, and live </w:t>
-      </w:r>
-      <w:proofErr w:type="spellStart"/>
-      <w:r>
-        <w:t>rts_system</w:t>
-      </w:r>
-      <w:proofErr w:type="spellEnd"/>
-      <w:r>
-        <w:t xml:space="preserve"> metadata). All principal entities appear in one diagram. Entity boxes list primary keys and principal attributes. Crow's-foot notation marks one-to-many relationships among users, inventory, honey production, products, POS sales, online orders, deliveries, and RTS cases.</w:t>
-      </w:r>
-    </w:p>
-    <w:p>
-      <w:pPr>
-        <w:pStyle w:val="Heading3"/>
+        <w:pStyle w:val="CapHeading3"/>
       </w:pPr>
       <w:bookmarkStart w:id="37" w:name="_Toc240539004"/>
       <w:r>
@@ -7196,11 +6662,7 @@
         <w:jc w:val="both"/>
       </w:pPr>
       <w:r>
-        <w:t xml:space="preserve">The core dictionary records actual field names, types, nullability, defaults, and keys for the principal tables supporting the five modules. Descriptions explain operational purpose. A dash means no explicit default or a SQL NULL default </w:t>
-      </w:r>
-      <w:r>
-        <w:lastRenderedPageBreak/>
-        <w:t>reported by metadata, not a literal stored dash. PRI means primary key, UNI means unique index, and MUL means a non-unique indexed column. Index labels do not by themselves establish foreign keys.</w:t>
+        <w:t>The core dictionary records actual field names, types, nullability, defaults, and keys for the principal tables supporting the five modules. Descriptions explain operational purpose. A dash means no explicit default or a SQL NULL default reported by metadata, not a literal stored dash. PRI means primary key, UNI means unique index, and MUL means a non-unique indexed column. Index labels do not by themselves establish foreign keys.</w:t>
       </w:r>
     </w:p>
     <w:p>
@@ -7208,6 +6670,7 @@
         <w:jc w:val="both"/>
       </w:pPr>
       <w:r>
+        <w:lastRenderedPageBreak/>
         <w:t>Supporting request, history, permission, issued-code, unit-tracking, and correction tables are not all reproduced in this core dictionary. Permanent SKU codes identify product types; additional unit and event tables preserve movement detail.</w:t>
       </w:r>
     </w:p>
@@ -8924,7 +8387,6 @@
         <w:rPr>
           <w:sz w:val="22"/>
         </w:rPr>
-        <w:lastRenderedPageBreak/>
         <w:t xml:space="preserve">Table </w:t>
       </w:r>
       <w:proofErr w:type="gramStart"/>
@@ -9394,6 +8856,7 @@
               <w:rPr>
                 <w:sz w:val="18"/>
               </w:rPr>
+              <w:lastRenderedPageBreak/>
               <w:t>created_​at</w:t>
             </w:r>
           </w:p>
@@ -11402,7 +10865,6 @@
               <w:rPr>
                 <w:sz w:val="18"/>
               </w:rPr>
-              <w:lastRenderedPageBreak/>
               <w:t>category</w:t>
             </w:r>
           </w:p>
@@ -11821,6 +11283,7 @@
               <w:rPr>
                 <w:sz w:val="18"/>
               </w:rPr>
+              <w:lastRenderedPageBreak/>
               <w:t>created_​at</w:t>
             </w:r>
           </w:p>
@@ -12108,19 +11571,21 @@
         <w:rPr>
           <w:sz w:val="22"/>
         </w:rPr>
-        <w:t>Table 3.10  Data Dictionary for stocks</w:t>
+        <w:t xml:space="preserve">Table </w:t>
       </w:r>
       <w:proofErr w:type="gramStart"/>
       <w:r>
         <w:rPr>
           <w:sz w:val="22"/>
         </w:rPr>
+        <w:t>3.10  Data</w:t>
       </w:r>
       <w:proofErr w:type="gramEnd"/>
       <w:r>
         <w:rPr>
           <w:sz w:val="22"/>
         </w:rPr>
+        <w:t xml:space="preserve"> Dictionary for stocks</w:t>
       </w:r>
     </w:p>
     <w:tbl>
@@ -13939,7 +13404,6 @@
               <w:rPr>
                 <w:sz w:val="18"/>
               </w:rPr>
-              <w:lastRenderedPageBreak/>
               <w:t>supplier_​name</w:t>
             </w:r>
           </w:p>
@@ -14342,6 +13806,7 @@
               <w:rPr>
                 <w:sz w:val="18"/>
               </w:rPr>
+              <w:lastRenderedPageBreak/>
               <w:t>created_​at</w:t>
             </w:r>
           </w:p>
@@ -14475,25 +13940,28 @@
         <w:rPr>
           <w:sz w:val="22"/>
         </w:rPr>
-        <w:t>Table 3.11  Data Dictionary for stock_entries</w:t>
+        <w:t xml:space="preserve">Table </w:t>
       </w:r>
       <w:proofErr w:type="gramStart"/>
       <w:r>
         <w:rPr>
           <w:sz w:val="22"/>
         </w:rPr>
+        <w:t>3.11  Data</w:t>
       </w:r>
       <w:proofErr w:type="gramEnd"/>
       <w:r>
         <w:rPr>
           <w:sz w:val="22"/>
         </w:rPr>
+        <w:t xml:space="preserve"> Dictionary for </w:t>
       </w:r>
       <w:proofErr w:type="spellStart"/>
       <w:r>
         <w:rPr>
           <w:sz w:val="22"/>
         </w:rPr>
+        <w:t>stock_entries</w:t>
       </w:r>
       <w:proofErr w:type="spellEnd"/>
     </w:p>
@@ -15744,25 +15212,28 @@
         <w:rPr>
           <w:sz w:val="22"/>
         </w:rPr>
-        <w:t>Table 3.12  Data Dictionary for honey_warehouse_rows</w:t>
+        <w:t xml:space="preserve">Table </w:t>
       </w:r>
       <w:proofErr w:type="gramStart"/>
       <w:r>
         <w:rPr>
           <w:sz w:val="22"/>
         </w:rPr>
+        <w:t>3.12  Data</w:t>
       </w:r>
       <w:proofErr w:type="gramEnd"/>
       <w:r>
         <w:rPr>
           <w:sz w:val="22"/>
         </w:rPr>
+        <w:t xml:space="preserve"> Dictionary for </w:t>
       </w:r>
       <w:proofErr w:type="spellStart"/>
       <w:r>
         <w:rPr>
           <w:sz w:val="22"/>
         </w:rPr>
+        <w:t>honey_warehouse_rows</w:t>
       </w:r>
       <w:proofErr w:type="spellEnd"/>
     </w:p>
@@ -16486,7 +15957,6 @@
               <w:rPr>
                 <w:sz w:val="18"/>
               </w:rPr>
-              <w:lastRenderedPageBreak/>
               <w:t>arrival_​date</w:t>
             </w:r>
           </w:p>
@@ -16875,6 +16345,7 @@
               <w:rPr>
                 <w:sz w:val="18"/>
               </w:rPr>
+              <w:lastRenderedPageBreak/>
               <w:t>initial_​qty</w:t>
             </w:r>
           </w:p>
@@ -17686,25 +17157,28 @@
         <w:rPr>
           <w:sz w:val="22"/>
         </w:rPr>
-        <w:t>Table 3.13  Data Dictionary for honey_production_rows</w:t>
+        <w:t xml:space="preserve">Table </w:t>
       </w:r>
       <w:proofErr w:type="gramStart"/>
       <w:r>
         <w:rPr>
           <w:sz w:val="22"/>
         </w:rPr>
+        <w:t>3.13  Data</w:t>
       </w:r>
       <w:proofErr w:type="gramEnd"/>
       <w:r>
         <w:rPr>
           <w:sz w:val="22"/>
         </w:rPr>
+        <w:t xml:space="preserve"> Dictionary for </w:t>
       </w:r>
       <w:proofErr w:type="spellStart"/>
       <w:r>
         <w:rPr>
           <w:sz w:val="22"/>
         </w:rPr>
+        <w:t>honey_production_rows</w:t>
       </w:r>
       <w:proofErr w:type="spellEnd"/>
     </w:p>
@@ -19076,7 +18550,6 @@
               <w:rPr>
                 <w:sz w:val="18"/>
               </w:rPr>
-              <w:lastRenderedPageBreak/>
               <w:t>transferred_​at</w:t>
             </w:r>
           </w:p>
@@ -19351,6 +18824,7 @@
               <w:rPr>
                 <w:sz w:val="18"/>
               </w:rPr>
+              <w:lastRenderedPageBreak/>
               <w:t>created_​at</w:t>
             </w:r>
           </w:p>
@@ -19484,25 +18958,28 @@
         <w:rPr>
           <w:sz w:val="22"/>
         </w:rPr>
-        <w:t>Table 3.14  Data Dictionary for honey_packaging_rows</w:t>
+        <w:t xml:space="preserve">Table </w:t>
       </w:r>
       <w:proofErr w:type="gramStart"/>
       <w:r>
         <w:rPr>
           <w:sz w:val="22"/>
         </w:rPr>
+        <w:t>3.14  Data</w:t>
       </w:r>
       <w:proofErr w:type="gramEnd"/>
       <w:r>
         <w:rPr>
           <w:sz w:val="22"/>
         </w:rPr>
+        <w:t xml:space="preserve"> Dictionary for </w:t>
       </w:r>
       <w:proofErr w:type="spellStart"/>
       <w:r>
         <w:rPr>
           <w:sz w:val="22"/>
         </w:rPr>
+        <w:t>honey_packaging_rows</w:t>
       </w:r>
       <w:proofErr w:type="spellEnd"/>
     </w:p>
@@ -21686,7 +21163,6 @@
               <w:rPr>
                 <w:sz w:val="18"/>
               </w:rPr>
-              <w:lastRenderedPageBreak/>
               <w:t>created_​at</w:t>
             </w:r>
           </w:p>
@@ -21820,25 +21296,29 @@
         <w:rPr>
           <w:sz w:val="22"/>
         </w:rPr>
-        <w:t>Table 3.15  Data Dictionary for dept_inventory_rows</w:t>
+        <w:lastRenderedPageBreak/>
+        <w:t xml:space="preserve">Table </w:t>
       </w:r>
       <w:proofErr w:type="gramStart"/>
       <w:r>
         <w:rPr>
           <w:sz w:val="22"/>
         </w:rPr>
+        <w:t>3.15  Data</w:t>
       </w:r>
       <w:proofErr w:type="gramEnd"/>
       <w:r>
         <w:rPr>
           <w:sz w:val="22"/>
         </w:rPr>
+        <w:t xml:space="preserve"> Dictionary for </w:t>
       </w:r>
       <w:proofErr w:type="spellStart"/>
       <w:r>
         <w:rPr>
           <w:sz w:val="22"/>
         </w:rPr>
+        <w:t>dept_inventory_rows</w:t>
       </w:r>
       <w:proofErr w:type="spellEnd"/>
     </w:p>
@@ -23357,19 +22837,21 @@
         <w:rPr>
           <w:sz w:val="22"/>
         </w:rPr>
-        <w:t>Table 3.16  Data Dictionary for products</w:t>
+        <w:t xml:space="preserve">Table </w:t>
       </w:r>
       <w:proofErr w:type="gramStart"/>
       <w:r>
         <w:rPr>
           <w:sz w:val="22"/>
         </w:rPr>
+        <w:t>3.16  Data</w:t>
       </w:r>
       <w:proofErr w:type="gramEnd"/>
       <w:r>
         <w:rPr>
           <w:sz w:val="22"/>
         </w:rPr>
+        <w:t xml:space="preserve"> Dictionary for products</w:t>
       </w:r>
     </w:p>
     <w:tbl>
@@ -24220,7 +23702,6 @@
               <w:rPr>
                 <w:sz w:val="18"/>
               </w:rPr>
-              <w:lastRenderedPageBreak/>
               <w:t>variant</w:t>
             </w:r>
           </w:p>
@@ -24751,6 +24232,7 @@
               <w:rPr>
                 <w:sz w:val="18"/>
               </w:rPr>
+              <w:lastRenderedPageBreak/>
               <w:t>created_​at</w:t>
             </w:r>
           </w:p>
@@ -24884,25 +24366,28 @@
         <w:rPr>
           <w:sz w:val="22"/>
         </w:rPr>
-        <w:t>Table 3.17  Data Dictionary for product_formula</w:t>
+        <w:t xml:space="preserve">Table </w:t>
       </w:r>
       <w:proofErr w:type="gramStart"/>
       <w:r>
         <w:rPr>
           <w:sz w:val="22"/>
         </w:rPr>
+        <w:t>3.17  Data</w:t>
       </w:r>
       <w:proofErr w:type="gramEnd"/>
       <w:r>
         <w:rPr>
           <w:sz w:val="22"/>
         </w:rPr>
+        <w:t xml:space="preserve"> Dictionary for </w:t>
       </w:r>
       <w:proofErr w:type="spellStart"/>
       <w:r>
         <w:rPr>
           <w:sz w:val="22"/>
         </w:rPr>
+        <w:t>product_formula</w:t>
       </w:r>
       <w:proofErr w:type="spellEnd"/>
     </w:p>
@@ -26027,25 +25512,28 @@
         <w:rPr>
           <w:sz w:val="22"/>
         </w:rPr>
-        <w:t>Table 3.18  Data Dictionary for fulfillment_pack_tiers</w:t>
+        <w:t xml:space="preserve">Table </w:t>
       </w:r>
       <w:proofErr w:type="gramStart"/>
       <w:r>
         <w:rPr>
           <w:sz w:val="22"/>
         </w:rPr>
+        <w:t>3.18  Data</w:t>
       </w:r>
       <w:proofErr w:type="gramEnd"/>
       <w:r>
         <w:rPr>
           <w:sz w:val="22"/>
         </w:rPr>
+        <w:t xml:space="preserve"> Dictionary for </w:t>
       </w:r>
       <w:proofErr w:type="spellStart"/>
       <w:r>
         <w:rPr>
           <w:sz w:val="22"/>
         </w:rPr>
+        <w:t>fulfillment_pack_tiers</w:t>
       </w:r>
       <w:proofErr w:type="spellEnd"/>
     </w:p>
@@ -26791,7 +26279,6 @@
               <w:rPr>
                 <w:sz w:val="18"/>
               </w:rPr>
-              <w:lastRenderedPageBreak/>
               <w:t>match_​rule</w:t>
             </w:r>
           </w:p>
@@ -27196,6 +26683,7 @@
               <w:rPr>
                 <w:sz w:val="18"/>
               </w:rPr>
+              <w:lastRenderedPageBreak/>
               <w:t>created_​at</w:t>
             </w:r>
           </w:p>
@@ -27483,25 +26971,28 @@
         <w:rPr>
           <w:sz w:val="22"/>
         </w:rPr>
-        <w:t>Table 3.19  Data Dictionary for fulfillment_pack_tier_lines</w:t>
+        <w:t xml:space="preserve">Table </w:t>
       </w:r>
       <w:proofErr w:type="gramStart"/>
       <w:r>
         <w:rPr>
           <w:sz w:val="22"/>
         </w:rPr>
+        <w:t>3.19  Data</w:t>
       </w:r>
       <w:proofErr w:type="gramEnd"/>
       <w:r>
         <w:rPr>
           <w:sz w:val="22"/>
         </w:rPr>
+        <w:t xml:space="preserve"> Dictionary for </w:t>
       </w:r>
       <w:proofErr w:type="spellStart"/>
       <w:r>
         <w:rPr>
           <w:sz w:val="22"/>
         </w:rPr>
+        <w:t>fulfillment_pack_tier_lines</w:t>
       </w:r>
       <w:proofErr w:type="spellEnd"/>
     </w:p>
@@ -29365,7 +28856,6 @@
               <w:rPr>
                 <w:sz w:val="18"/>
               </w:rPr>
-              <w:lastRenderedPageBreak/>
               <w:t>status</w:t>
             </w:r>
           </w:p>
@@ -29634,6 +29124,7 @@
               <w:rPr>
                 <w:sz w:val="18"/>
               </w:rPr>
+              <w:lastRenderedPageBreak/>
               <w:t>completed_​at</w:t>
             </w:r>
           </w:p>
@@ -31809,7 +31300,6 @@
         <w:rPr>
           <w:sz w:val="22"/>
         </w:rPr>
-        <w:lastRenderedPageBreak/>
         <w:t xml:space="preserve">Table </w:t>
       </w:r>
       <w:proofErr w:type="gramStart"/>
@@ -32154,6 +31644,7 @@
               <w:rPr>
                 <w:sz w:val="18"/>
               </w:rPr>
+              <w:lastRenderedPageBreak/>
               <w:t>csr</w:t>
             </w:r>
             <w:proofErr w:type="spellEnd"/>
@@ -34580,7 +34071,6 @@
               <w:rPr>
                 <w:sz w:val="18"/>
               </w:rPr>
-              <w:lastRenderedPageBreak/>
               <w:t>rts</w:t>
             </w:r>
             <w:proofErr w:type="spellEnd"/>
@@ -34722,6 +34212,7 @@
               <w:rPr>
                 <w:sz w:val="18"/>
               </w:rPr>
+              <w:lastRenderedPageBreak/>
               <w:t>created_​at</w:t>
             </w:r>
           </w:p>
@@ -36900,7 +36391,6 @@
               <w:rPr>
                 <w:sz w:val="18"/>
               </w:rPr>
-              <w:lastRenderedPageBreak/>
               <w:t>resolved_​at</w:t>
             </w:r>
           </w:p>
@@ -37027,6 +36517,7 @@
               <w:rPr>
                 <w:sz w:val="18"/>
               </w:rPr>
+              <w:lastRenderedPageBreak/>
               <w:t>resolved_​by_​user_​id</w:t>
             </w:r>
           </w:p>
@@ -39249,7 +38740,6 @@
               <w:rPr>
                 <w:sz w:val="18"/>
               </w:rPr>
-              <w:lastRenderedPageBreak/>
               <w:t>claim_​status</w:t>
             </w:r>
           </w:p>
@@ -39392,6 +38882,7 @@
               <w:rPr>
                 <w:sz w:val="18"/>
               </w:rPr>
+              <w:lastRenderedPageBreak/>
               <w:t>claim_​status_​note</w:t>
             </w:r>
           </w:p>
@@ -41762,7 +41253,6 @@
               <w:rPr>
                 <w:sz w:val="18"/>
               </w:rPr>
-              <w:lastRenderedPageBreak/>
               <w:t>combo_​honey_​variant</w:t>
             </w:r>
           </w:p>
@@ -41897,6 +41387,7 @@
               <w:rPr>
                 <w:sz w:val="18"/>
               </w:rPr>
+              <w:lastRenderedPageBreak/>
               <w:t>quantity</w:t>
             </w:r>
           </w:p>
@@ -44387,7 +43878,6 @@
               <w:rPr>
                 <w:sz w:val="18"/>
               </w:rPr>
-              <w:lastRenderedPageBreak/>
               <w:t>current_​gallon</w:t>
             </w:r>
           </w:p>
@@ -44522,6 +44012,7 @@
               <w:rPr>
                 <w:sz w:val="18"/>
               </w:rPr>
+              <w:lastRenderedPageBreak/>
               <w:t>initial_​gallon</w:t>
             </w:r>
           </w:p>
@@ -51612,7 +51103,7 @@
     </w:p>
     <w:p>
       <w:pPr>
-        <w:pStyle w:val="Heading3"/>
+        <w:pStyle w:val="CapHeading3"/>
       </w:pPr>
       <w:bookmarkStart w:id="38" w:name="_Toc240539005"/>
       <w:r>
@@ -51633,7 +51124,7 @@
           <w:noProof/>
         </w:rPr>
         <w:drawing>
-          <wp:inline distT="0" distB="0" distL="0" distR="0" wp14:anchorId="2EA8D063" wp14:editId="1D4F2F66">
+          <wp:inline distT="0" distB="0" distL="0" distR="0" wp14:anchorId="64CAA545" wp14:editId="4D333A8E">
             <wp:extent cx="5486400" cy="3200400"/>
             <wp:effectExtent l="0" t="0" r="0" b="0"/>
             <wp:docPr id="17" name="Picture 17"/>
@@ -51676,19 +51167,15 @@
         <w:jc w:val="center"/>
       </w:pPr>
       <w:r>
-        <w:t>Figure 3.16  Network Design of Pyx Tracker</w:t>
+        <w:t xml:space="preserve">Figure </w:t>
       </w:r>
       <w:proofErr w:type="gramStart"/>
-      <w:r/>
+      <w:r>
+        <w:t>3.16  Network</w:t>
+      </w:r>
       <w:proofErr w:type="gramEnd"/>
-      <w:r/>
-    </w:p>
-    <w:p>
-      <w:pPr>
-        <w:jc w:val="both"/>
-      </w:pPr>
       <w:r>
-        <w:t>A network design outlines the architecture that supports communication between various devices. The network diagram below depicts a Wireless LAN (WLAN) configuration where multiple devices connect to a central Wi-Fi router. In this design, the router serves as the hub, providing wireless internet access to all connected devices. These devices, including Admin/Executive and Staff workstations and Staff mobile phones, establish connections to the application server, forming the core communication layer within the network and ensuring uninterrupted access for users.</w:t>
+        <w:t xml:space="preserve"> Design of Pyx Tracker</w:t>
       </w:r>
     </w:p>
     <w:p>
@@ -51696,16 +51183,24 @@
         <w:jc w:val="both"/>
       </w:pPr>
       <w:r>
-        <w:t>This figure shows the network design.</w:t>
+        <w:t>Figure 3.16 presents the Network Design of Pyx Tracker for the Pyx Food Products site. The Internet/ISP uplink is mediated by a Firewall before Router #1 (core gateway). Executive/Admin workstations and the application server connect to Router #1. A LAN switch distributes traffic to Router #3 for the CSR workstation, while Router #2 provides Wi-Fi access. Dashed links connect Router #2 to the Android POS Device and Staff Mobile Phone. The POS Device links to an ESC/POS thermal printer (Bluetooth/Wi-Fi) and a barcode scanner (USB/Bluetooth) used for product lookup at checkout. Solid lines represent wired LAN or uplink paths. The Network Topology figure that follows is unchanged.</w:t>
       </w:r>
     </w:p>
     <w:p>
       <w:pPr>
-        <w:pStyle w:val="Heading3"/>
+        <w:jc w:val="both"/>
+      </w:pPr>
+      <w:r>
+        <w:lastRenderedPageBreak/>
+        <w:t>Figure 3.16 presents the Network Design of Pyx Tracker for the Pyx Food Products site. The Internet/ISP uplink is mediated by a Firewall before Router #1 (core gateway). Executive/Admin workstations and the application server connect to Router #1. A LAN switch distributes traffic to Router #3 for the CSR workstation, while Router #2 provides Wi-Fi access. Dashed links connect Router #2 to the Android POS Device and Staff Mobile Phone. The POS Device links to an ESC/POS thermal printer (Bluetooth/Wi-Fi) and a barcode scanner (USB/Bluetooth) used for product lookup at checkout. Solid lines represent wired LAN or uplink paths. The Network Topology figure that follows is unchanged.</w:t>
+      </w:r>
+    </w:p>
+    <w:p>
+      <w:pPr>
+        <w:pStyle w:val="CapHeading3"/>
       </w:pPr>
       <w:bookmarkStart w:id="39" w:name="_Toc240539006"/>
       <w:r>
-        <w:lastRenderedPageBreak/>
         <w:t>Network Topology</w:t>
       </w:r>
       <w:bookmarkEnd w:id="39"/>
@@ -51722,7 +51217,7 @@
           <w:noProof/>
         </w:rPr>
         <w:drawing>
-          <wp:inline distT="0" distB="0" distL="0" distR="0" wp14:anchorId="01DA0FD6" wp14:editId="259E2590">
+          <wp:inline distT="0" distB="0" distL="0" distR="0" wp14:anchorId="415A4868" wp14:editId="3F988A0F">
             <wp:extent cx="5486400" cy="3413760"/>
             <wp:effectExtent l="0" t="0" r="0" b="0"/>
             <wp:docPr id="18" name="Picture 18"/>
@@ -51765,45 +51260,50 @@
         <w:jc w:val="center"/>
       </w:pPr>
       <w:r>
-        <w:t>Figure 3.17  Star Topology for Local Access</w:t>
+        <w:t xml:space="preserve">Figure </w:t>
       </w:r>
       <w:proofErr w:type="gramStart"/>
-      <w:r/>
+      <w:r>
+        <w:t>3.17  Star</w:t>
+      </w:r>
       <w:proofErr w:type="gramEnd"/>
-      <w:r/>
+      <w:r>
+        <w:t xml:space="preserve"> Topology for Local Access</w:t>
+      </w:r>
     </w:p>
     <w:p>
       <w:pPr>
         <w:jc w:val="both"/>
       </w:pPr>
       <w:r>
-        <w:t>Clients connect through a router or access point. A LAN server uses this local infrastructure; a remote server is reached through the internet uplink. This is a logical topology pending confirmation of the installed arrangement.</w:t>
+        <w:lastRenderedPageBreak/>
+        <w:t>Clients connect through a router or access point in a logical star. End nodes include Admin/Executive and Staff/CSR workstations, Staff mobile phones, the Android POS Device (Mobile POS), and the application server. A remote or hosted server still requires an internet uplink, as shown in the Network Design. Thermal printer and barcode scanner peripherals are documented in Network Design only, not as separate topology nodes.</w:t>
       </w:r>
     </w:p>
     <w:p>
       <w:pPr>
-        <w:pStyle w:val="Heading3"/>
+        <w:pStyle w:val="CapHeading3"/>
       </w:pPr>
       <w:bookmarkStart w:id="40" w:name="_Toc240539007"/>
     </w:p>
     <w:p>
       <w:pPr>
-        <w:pStyle w:val="Heading3"/>
+        <w:pStyle w:val="CapHeading3"/>
       </w:pPr>
     </w:p>
     <w:p>
       <w:pPr>
-        <w:pStyle w:val="Heading3"/>
+        <w:pStyle w:val="CapHeading3"/>
       </w:pPr>
     </w:p>
     <w:p>
       <w:pPr>
-        <w:pStyle w:val="Heading3"/>
+        <w:pStyle w:val="CapHeading3"/>
       </w:pPr>
     </w:p>
     <w:p>
       <w:pPr>
-        <w:pStyle w:val="Heading3"/>
+        <w:pStyle w:val="CapHeading3"/>
       </w:pPr>
       <w:r>
         <w:t>Technology Stack Development</w:t>
@@ -51829,10 +51329,11 @@
           <w:rFonts w:cs="Arial"/>
           <w:noProof/>
         </w:rPr>
+        <w:lastRenderedPageBreak/>
         <mc:AlternateContent>
           <mc:Choice Requires="wps">
             <w:drawing>
-              <wp:anchor distT="0" distB="0" distL="114300" distR="114300" simplePos="0" relativeHeight="251667456" behindDoc="0" locked="0" layoutInCell="1" allowOverlap="1" wp14:anchorId="5285C932" wp14:editId="419DDE94">
+              <wp:anchor distT="0" distB="0" distL="114300" distR="114300" simplePos="0" relativeHeight="251667456" behindDoc="0" locked="0" layoutInCell="1" allowOverlap="1" wp14:anchorId="59F537D7" wp14:editId="2F6C1D81">
                 <wp:simplePos x="0" y="0"/>
                 <wp:positionH relativeFrom="column">
                   <wp:posOffset>3933190</wp:posOffset>
@@ -51999,7 +51500,7 @@
         <mc:AlternateContent>
           <mc:Choice Requires="wps">
             <w:drawing>
-              <wp:anchor distT="0" distB="0" distL="114300" distR="114300" simplePos="0" relativeHeight="251668480" behindDoc="0" locked="0" layoutInCell="1" allowOverlap="1" wp14:anchorId="77F816DF" wp14:editId="6C3EC1EC">
+              <wp:anchor distT="0" distB="0" distL="114300" distR="114300" simplePos="0" relativeHeight="251668480" behindDoc="0" locked="0" layoutInCell="1" allowOverlap="1" wp14:anchorId="61B4B501" wp14:editId="6C90CAB7">
                 <wp:simplePos x="0" y="0"/>
                 <wp:positionH relativeFrom="column">
                   <wp:posOffset>2786332</wp:posOffset>
@@ -52129,7 +51630,7 @@
         <mc:AlternateContent>
           <mc:Choice Requires="wps">
             <w:drawing>
-              <wp:anchor distT="0" distB="0" distL="114300" distR="114300" simplePos="0" relativeHeight="251662336" behindDoc="0" locked="0" layoutInCell="1" allowOverlap="1" wp14:anchorId="1A93059B" wp14:editId="2B27446F">
+              <wp:anchor distT="0" distB="0" distL="114300" distR="114300" simplePos="0" relativeHeight="251662336" behindDoc="0" locked="0" layoutInCell="1" allowOverlap="1" wp14:anchorId="09BDC924" wp14:editId="50DA2AE4">
                 <wp:simplePos x="0" y="0"/>
                 <wp:positionH relativeFrom="column">
                   <wp:posOffset>1612685</wp:posOffset>
@@ -52289,7 +51790,7 @@
         <mc:AlternateContent>
           <mc:Choice Requires="wps">
             <w:drawing>
-              <wp:anchor distT="0" distB="0" distL="114300" distR="114300" simplePos="0" relativeHeight="251663360" behindDoc="0" locked="0" layoutInCell="1" allowOverlap="1" wp14:anchorId="7393A800" wp14:editId="67A8BF4E">
+              <wp:anchor distT="0" distB="0" distL="114300" distR="114300" simplePos="0" relativeHeight="251663360" behindDoc="0" locked="0" layoutInCell="1" allowOverlap="1" wp14:anchorId="5CAC4B3D" wp14:editId="58CF37E7">
                 <wp:simplePos x="0" y="0"/>
                 <wp:positionH relativeFrom="column">
                   <wp:posOffset>-38100</wp:posOffset>
@@ -52454,7 +51955,7 @@
         <mc:AlternateContent>
           <mc:Choice Requires="wps">
             <w:drawing>
-              <wp:anchor distT="0" distB="0" distL="114300" distR="114300" simplePos="0" relativeHeight="251664384" behindDoc="0" locked="0" layoutInCell="1" allowOverlap="1" wp14:anchorId="2209752C" wp14:editId="1378FE94">
+              <wp:anchor distT="0" distB="0" distL="114300" distR="114300" simplePos="0" relativeHeight="251664384" behindDoc="0" locked="0" layoutInCell="1" allowOverlap="1" wp14:anchorId="20A08378" wp14:editId="48E0514F">
                 <wp:simplePos x="0" y="0"/>
                 <wp:positionH relativeFrom="column">
                   <wp:posOffset>897890</wp:posOffset>
@@ -52695,7 +52196,7 @@
         <mc:AlternateContent>
           <mc:Choice Requires="wps">
             <w:drawing>
-              <wp:anchor distT="0" distB="0" distL="114300" distR="114300" simplePos="0" relativeHeight="251666432" behindDoc="0" locked="0" layoutInCell="1" allowOverlap="1" wp14:anchorId="7FE7CA66" wp14:editId="7A4CB299">
+              <wp:anchor distT="0" distB="0" distL="114300" distR="114300" simplePos="0" relativeHeight="251666432" behindDoc="0" locked="0" layoutInCell="1" allowOverlap="1" wp14:anchorId="609C1ECF" wp14:editId="6056E69B">
                 <wp:simplePos x="0" y="0"/>
                 <wp:positionH relativeFrom="column">
                   <wp:posOffset>3088640</wp:posOffset>
@@ -52844,7 +52345,7 @@
         <mc:AlternateContent>
           <mc:Choice Requires="wps">
             <w:drawing>
-              <wp:anchor distT="0" distB="0" distL="114300" distR="114300" simplePos="0" relativeHeight="251661312" behindDoc="0" locked="0" layoutInCell="1" allowOverlap="1" wp14:anchorId="6B6C880C" wp14:editId="3DAC26ED">
+              <wp:anchor distT="0" distB="0" distL="114300" distR="114300" simplePos="0" relativeHeight="251661312" behindDoc="0" locked="0" layoutInCell="1" allowOverlap="1" wp14:anchorId="00D9A85F" wp14:editId="391CF2BE">
                 <wp:simplePos x="0" y="0"/>
                 <wp:positionH relativeFrom="column">
                   <wp:posOffset>2804795</wp:posOffset>
@@ -53009,7 +52510,7 @@
           <w:noProof/>
         </w:rPr>
         <w:drawing>
-          <wp:anchor distT="0" distB="0" distL="114300" distR="114300" simplePos="0" relativeHeight="251665408" behindDoc="1" locked="0" layoutInCell="1" allowOverlap="1" wp14:anchorId="105E219A" wp14:editId="2D0A0F11">
+          <wp:anchor distT="0" distB="0" distL="114300" distR="114300" simplePos="0" relativeHeight="251665408" behindDoc="1" locked="0" layoutInCell="1" allowOverlap="1" wp14:anchorId="26993FA3" wp14:editId="602B22A2">
             <wp:simplePos x="0" y="0"/>
             <wp:positionH relativeFrom="column">
               <wp:posOffset>2678430</wp:posOffset>
@@ -53077,7 +52578,7 @@
           <w:noProof/>
         </w:rPr>
         <w:drawing>
-          <wp:anchor distT="0" distB="0" distL="114300" distR="114300" simplePos="0" relativeHeight="251659264" behindDoc="0" locked="0" layoutInCell="1" allowOverlap="1" wp14:anchorId="3C502766" wp14:editId="73B12697">
+          <wp:anchor distT="0" distB="0" distL="114300" distR="114300" simplePos="0" relativeHeight="251659264" behindDoc="0" locked="0" layoutInCell="1" allowOverlap="1" wp14:anchorId="71DC998F" wp14:editId="36FBF4B1">
             <wp:simplePos x="0" y="0"/>
             <wp:positionH relativeFrom="column">
               <wp:posOffset>1284605</wp:posOffset>
@@ -53145,7 +52646,7 @@
           <w:noProof/>
         </w:rPr>
         <w:drawing>
-          <wp:anchor distT="0" distB="0" distL="114300" distR="114300" simplePos="0" relativeHeight="251660288" behindDoc="1" locked="0" layoutInCell="1" allowOverlap="1" wp14:anchorId="442FA4B7" wp14:editId="72CED11A">
+          <wp:anchor distT="0" distB="0" distL="114300" distR="114300" simplePos="0" relativeHeight="251660288" behindDoc="1" locked="0" layoutInCell="1" allowOverlap="1" wp14:anchorId="7AE6F9F2" wp14:editId="0A0FBC58">
             <wp:simplePos x="0" y="0"/>
             <wp:positionH relativeFrom="column">
               <wp:posOffset>-203200</wp:posOffset>
@@ -53238,20 +52739,12 @@
         <w:jc w:val="both"/>
       </w:pPr>
       <w:r>
-        <w:t xml:space="preserve">The stack follows the proposal and reviewed project: React and TypeScript for the interface, Tailwind CSS for presentation, PHP for business actions, MySQL for persistent records, and Python for document utilities. </w:t>
-      </w:r>
-      <w:proofErr w:type="spellStart"/>
-      <w:r>
-        <w:t>Vite</w:t>
-      </w:r>
-      <w:proofErr w:type="spellEnd"/>
-      <w:r>
-        <w:t xml:space="preserve"> supports frontend builds. Defined API actions connect these components.</w:t>
+        <w:t>The stack follows the proposal and reviewed project: React and TypeScript for the web interface, Tailwind CSS for presentation, PHP for business actions, MySQL for persistent records, and Python for document utilities. Vite supports frontend builds. The companion Mobile POS terminal is implemented in Flutter (Dart) for Android and connects to the same RTS API for authentication, checkout, sales history, and refunds, with a native ESC/POS print bridge for Bluetooth, USB, and Wi-Fi printers. Defined API actions connect these components.</w:t>
       </w:r>
     </w:p>
     <w:p>
       <w:pPr>
-        <w:pStyle w:val="Heading3"/>
+        <w:pStyle w:val="CapHeading3"/>
       </w:pPr>
       <w:bookmarkStart w:id="41" w:name="_Toc240539008"/>
       <w:r>
@@ -53270,19 +52763,21 @@
         <w:rPr>
           <w:sz w:val="22"/>
         </w:rPr>
-        <w:t>Table 3.32  The Software Specification Table for Pyx Tracker: Web-based Enterprise Operations Management System.</w:t>
+        <w:t xml:space="preserve">Table </w:t>
       </w:r>
       <w:proofErr w:type="gramStart"/>
       <w:r>
         <w:rPr>
           <w:sz w:val="22"/>
         </w:rPr>
+        <w:t>3.32  The</w:t>
       </w:r>
       <w:proofErr w:type="gramEnd"/>
       <w:r>
         <w:rPr>
           <w:sz w:val="22"/>
         </w:rPr>
+        <w:t xml:space="preserve"> Software Specification Table for Pyx Tracker: Web-based Enterprise Operations Management System.</w:t>
       </w:r>
     </w:p>
     <w:tbl>
@@ -53296,10 +52791,11 @@
           <w:insideH w:val="single" w:sz="4" w:space="0" w:color="000000"/>
           <w:insideV w:val="single" w:sz="4" w:space="0" w:color="000000"/>
         </w:tblBorders>
+        <w:tblLook w:val="04A0" w:firstRow="1" w:lastRow="0" w:firstColumn="1" w:lastColumn="0" w:noHBand="0" w:noVBand="1"/>
       </w:tblPr>
       <w:tblGrid>
-        <w:gridCol w:w="4500"/>
-        <w:gridCol w:w="4500"/>
+        <w:gridCol w:w="4319"/>
+        <w:gridCol w:w="4311"/>
       </w:tblGrid>
       <w:tr>
         <w:tc>
@@ -53310,10 +52806,60 @@
             <w:r>
               <w:rPr>
                 <w:rFonts w:ascii="Times New Roman" w:hAnsi="Times New Roman"/>
+                <w:b/>
                 <w:sz w:val="22"/>
+              </w:rPr>
+              <w:t>Software Requirements</w:t>
+            </w:r>
+          </w:p>
+        </w:tc>
+        <w:tc>
+          <w:tcPr>
+            <w:tcW w:w="4500" w:type="dxa"/>
+          </w:tcPr>
+          <w:p/>
+        </w:tc>
+      </w:tr>
+      <w:tr>
+        <w:tc>
+          <w:tcPr>
+            <w:tcW w:w="4500" w:type="dxa"/>
+          </w:tcPr>
+          <w:p>
+            <w:r>
+              <w:rPr>
+                <w:rFonts w:ascii="Times New Roman" w:hAnsi="Times New Roman"/>
                 <w:b/>
-              </w:rPr>
-              <w:t xml:space="preserve">Software Requirements</w:t>
+                <w:sz w:val="22"/>
+              </w:rPr>
+              <w:t>Language</w:t>
+            </w:r>
+          </w:p>
+        </w:tc>
+        <w:tc>
+          <w:tcPr>
+            <w:tcW w:w="4500" w:type="dxa"/>
+          </w:tcPr>
+          <w:p>
+            <w:r>
+              <w:t>PHP, React, TypeScript, Flutter (Dart)</w:t>
+            </w:r>
+          </w:p>
+        </w:tc>
+      </w:tr>
+      <w:tr>
+        <w:tc>
+          <w:tcPr>
+            <w:tcW w:w="4500" w:type="dxa"/>
+          </w:tcPr>
+          <w:p>
+            <w:r>
+              <w:rPr>
+                <w:rFonts w:ascii="Times New Roman" w:hAnsi="Times New Roman"/>
+                <w:b/>
+                <w:sz w:val="22"/>
+              </w:rPr>
+              <w:t>Technology</w:t>
             </w:r>
           </w:p>
         </w:tc>
@@ -53327,7 +52873,7 @@
                 <w:rFonts w:ascii="Times New Roman" w:hAnsi="Times New Roman"/>
                 <w:sz w:val="22"/>
               </w:rPr>
-              <w:t xml:space="preserve"/>
+              <w:t>Visual Studio Code</w:t>
             </w:r>
           </w:p>
         </w:tc>
@@ -53341,10 +52887,10 @@
             <w:r>
               <w:rPr>
                 <w:rFonts w:ascii="Times New Roman" w:hAnsi="Times New Roman"/>
+                <w:b/>
                 <w:sz w:val="22"/>
-                <w:b/>
-              </w:rPr>
-              <w:t xml:space="preserve">Language</w:t>
+              </w:rPr>
+              <w:t>Database</w:t>
             </w:r>
           </w:p>
         </w:tc>
@@ -53358,7 +52904,7 @@
                 <w:rFonts w:ascii="Times New Roman" w:hAnsi="Times New Roman"/>
                 <w:sz w:val="22"/>
               </w:rPr>
-              <w:t xml:space="preserve">PHP, React, TypeScript</w:t>
+              <w:t>MySQL</w:t>
             </w:r>
           </w:p>
         </w:tc>
@@ -53372,10 +52918,10 @@
             <w:r>
               <w:rPr>
                 <w:rFonts w:ascii="Times New Roman" w:hAnsi="Times New Roman"/>
+                <w:b/>
                 <w:sz w:val="22"/>
-                <w:b/>
-              </w:rPr>
-              <w:t xml:space="preserve">Technology</w:t>
+              </w:rPr>
+              <w:t>IDE</w:t>
             </w:r>
           </w:p>
         </w:tc>
@@ -53389,7 +52935,7 @@
                 <w:rFonts w:ascii="Times New Roman" w:hAnsi="Times New Roman"/>
                 <w:sz w:val="22"/>
               </w:rPr>
-              <w:t xml:space="preserve">Visual Studio Code</w:t>
+              <w:t>Visual Studio Code</w:t>
             </w:r>
           </w:p>
         </w:tc>
@@ -53403,10 +52949,10 @@
             <w:r>
               <w:rPr>
                 <w:rFonts w:ascii="Times New Roman" w:hAnsi="Times New Roman"/>
+                <w:b/>
                 <w:sz w:val="22"/>
-                <w:b/>
-              </w:rPr>
-              <w:t xml:space="preserve">Database</w:t>
+              </w:rPr>
+              <w:t>Operating system</w:t>
             </w:r>
           </w:p>
         </w:tc>
@@ -53416,73 +52962,7 @@
           </w:tcPr>
           <w:p>
             <w:r>
-              <w:rPr>
-                <w:rFonts w:ascii="Times New Roman" w:hAnsi="Times New Roman"/>
-                <w:sz w:val="22"/>
-              </w:rPr>
-              <w:t xml:space="preserve">MySQL</w:t>
-            </w:r>
-          </w:p>
-        </w:tc>
-      </w:tr>
-      <w:tr>
-        <w:tc>
-          <w:tcPr>
-            <w:tcW w:w="4500" w:type="dxa"/>
-          </w:tcPr>
-          <w:p>
-            <w:r>
-              <w:rPr>
-                <w:rFonts w:ascii="Times New Roman" w:hAnsi="Times New Roman"/>
-                <w:sz w:val="22"/>
-                <w:b/>
-              </w:rPr>
-              <w:t xml:space="preserve">IDE</w:t>
-            </w:r>
-          </w:p>
-        </w:tc>
-        <w:tc>
-          <w:tcPr>
-            <w:tcW w:w="4500" w:type="dxa"/>
-          </w:tcPr>
-          <w:p>
-            <w:r>
-              <w:rPr>
-                <w:rFonts w:ascii="Times New Roman" w:hAnsi="Times New Roman"/>
-                <w:sz w:val="22"/>
-              </w:rPr>
-              <w:t xml:space="preserve">Visual Studio Code</w:t>
-            </w:r>
-          </w:p>
-        </w:tc>
-      </w:tr>
-      <w:tr>
-        <w:tc>
-          <w:tcPr>
-            <w:tcW w:w="4500" w:type="dxa"/>
-          </w:tcPr>
-          <w:p>
-            <w:r>
-              <w:rPr>
-                <w:rFonts w:ascii="Times New Roman" w:hAnsi="Times New Roman"/>
-                <w:sz w:val="22"/>
-                <w:b/>
-              </w:rPr>
-              <w:t xml:space="preserve">Operating system</w:t>
-            </w:r>
-          </w:p>
-        </w:tc>
-        <w:tc>
-          <w:tcPr>
-            <w:tcW w:w="4500" w:type="dxa"/>
-          </w:tcPr>
-          <w:p>
-            <w:r>
-              <w:rPr>
-                <w:rFonts w:ascii="Times New Roman" w:hAnsi="Times New Roman"/>
-                <w:sz w:val="22"/>
-              </w:rPr>
-              <w:t xml:space="preserve">Microsoft Windows 11</w:t>
+              <w:t>Microsoft Windows 11 (web/server); Android (Mobile POS)</w:t>
             </w:r>
           </w:p>
         </w:tc>
@@ -53496,10 +52976,11 @@
     </w:p>
     <w:p>
       <w:pPr>
-        <w:pStyle w:val="Heading3"/>
+        <w:pStyle w:val="CapHeading3"/>
       </w:pPr>
       <w:bookmarkStart w:id="42" w:name="_Toc240539009"/>
       <w:r>
+        <w:lastRenderedPageBreak/>
         <w:t>Hardware Specification</w:t>
       </w:r>
       <w:bookmarkEnd w:id="42"/>
@@ -53511,7 +52992,6 @@
       <w:r>
         <w:t>Hardware values state the minimum recommended configuration for development and local deployment. Installed equipment at Pyx Food Products should be confirmed against this table.</w:t>
       </w:r>
-      <w:r/>
     </w:p>
     <w:p>
       <w:pPr>
@@ -53524,19 +53004,21 @@
         <w:rPr>
           <w:sz w:val="22"/>
         </w:rPr>
-        <w:t>Table 3.33  The Hardware Specification Table for Pyx Tracker: Web-based Enterprise Operations Management System.</w:t>
+        <w:t xml:space="preserve">Table </w:t>
       </w:r>
       <w:proofErr w:type="gramStart"/>
       <w:r>
         <w:rPr>
           <w:sz w:val="22"/>
         </w:rPr>
+        <w:t>3.33  The</w:t>
       </w:r>
       <w:proofErr w:type="gramEnd"/>
       <w:r>
         <w:rPr>
           <w:sz w:val="22"/>
         </w:rPr>
+        <w:t xml:space="preserve"> Hardware Specification Table for Pyx Tracker: Web-based Enterprise Operations Management System.</w:t>
       </w:r>
     </w:p>
     <w:tbl>
@@ -53550,10 +53032,11 @@
           <w:insideH w:val="single" w:sz="4" w:space="0" w:color="000000"/>
           <w:insideV w:val="single" w:sz="4" w:space="0" w:color="000000"/>
         </w:tblBorders>
+        <w:tblLook w:val="04A0" w:firstRow="1" w:lastRow="0" w:firstColumn="1" w:lastColumn="0" w:noHBand="0" w:noVBand="1"/>
       </w:tblPr>
       <w:tblGrid>
-        <w:gridCol w:w="4500"/>
-        <w:gridCol w:w="4500"/>
+        <w:gridCol w:w="4310"/>
+        <w:gridCol w:w="4320"/>
       </w:tblGrid>
       <w:tr>
         <w:tc>
@@ -53564,10 +53047,10 @@
             <w:r>
               <w:rPr>
                 <w:rFonts w:ascii="Times New Roman" w:hAnsi="Times New Roman"/>
+                <w:b/>
                 <w:sz w:val="22"/>
-                <w:b/>
-              </w:rPr>
-              <w:t xml:space="preserve">Processor</w:t>
+              </w:rPr>
+              <w:t>Processor</w:t>
             </w:r>
           </w:p>
         </w:tc>
@@ -53581,7 +53064,7 @@
                 <w:rFonts w:ascii="Times New Roman" w:hAnsi="Times New Roman"/>
                 <w:sz w:val="22"/>
               </w:rPr>
-              <w:t xml:space="preserve">Intel Core i5 or equivalent</w:t>
+              <w:t>Intel Core i5 or equivalent</w:t>
             </w:r>
           </w:p>
         </w:tc>
@@ -53595,10 +53078,10 @@
             <w:r>
               <w:rPr>
                 <w:rFonts w:ascii="Times New Roman" w:hAnsi="Times New Roman"/>
+                <w:b/>
                 <w:sz w:val="22"/>
-                <w:b/>
-              </w:rPr>
-              <w:t xml:space="preserve">Solid State Drive</w:t>
+              </w:rPr>
+              <w:t>Solid State Drive</w:t>
             </w:r>
           </w:p>
         </w:tc>
@@ -53612,7 +53095,7 @@
                 <w:rFonts w:ascii="Times New Roman" w:hAnsi="Times New Roman"/>
                 <w:sz w:val="22"/>
               </w:rPr>
-              <w:t xml:space="preserve">250 GB</w:t>
+              <w:t>250 GB</w:t>
             </w:r>
           </w:p>
         </w:tc>
@@ -53626,10 +53109,10 @@
             <w:r>
               <w:rPr>
                 <w:rFonts w:ascii="Times New Roman" w:hAnsi="Times New Roman"/>
+                <w:b/>
                 <w:sz w:val="22"/>
-                <w:b/>
-              </w:rPr>
-              <w:t xml:space="preserve">Ram</w:t>
+              </w:rPr>
+              <w:t>Ram</w:t>
             </w:r>
           </w:p>
         </w:tc>
@@ -53643,7 +53126,54 @@
                 <w:rFonts w:ascii="Times New Roman" w:hAnsi="Times New Roman"/>
                 <w:sz w:val="22"/>
               </w:rPr>
-              <w:t xml:space="preserve">8 GB RAM</w:t>
+              <w:t>8 GB RAM</w:t>
+            </w:r>
+          </w:p>
+        </w:tc>
+      </w:tr>
+      <w:tr>
+        <w:tc>
+          <w:tcPr>
+            <w:tcW w:w="4331" w:type="dxa"/>
+          </w:tcPr>
+          <w:p>
+            <w:r>
+              <w:t xml:space="preserve">Android device </w:t>
+            </w:r>
+            <w:r>
+              <w:t>(Mobile POS)</w:t>
+            </w:r>
+          </w:p>
+        </w:tc>
+        <w:tc>
+          <w:tcPr>
+            <w:tcW w:w="4299" w:type="dxa"/>
+          </w:tcPr>
+          <w:p>
+            <w:r>
+              <w:t>Android phone or tablet with camera and Bluetooth</w:t>
+            </w:r>
+          </w:p>
+        </w:tc>
+      </w:tr>
+      <w:tr>
+        <w:tc>
+          <w:tcPr>
+            <w:tcW w:w="4331" w:type="dxa"/>
+          </w:tcPr>
+          <w:p>
+            <w:r>
+              <w:t>Thermal printer (Mobile POS)</w:t>
+            </w:r>
+          </w:p>
+        </w:tc>
+        <w:tc>
+          <w:tcPr>
+            <w:tcW w:w="4299" w:type="dxa"/>
+          </w:tcPr>
+          <w:p>
+            <w:r>
+              <w:t>ESC/POS printer (Bluetooth / USB / Wi-Fi port 9100)</w:t>
             </w:r>
           </w:p>
         </w:tc>
@@ -53657,7 +53187,7 @@
     </w:p>
     <w:p>
       <w:pPr>
-        <w:pStyle w:val="Heading3"/>
+        <w:pStyle w:val="CapHeading3"/>
       </w:pPr>
       <w:bookmarkStart w:id="43" w:name="_Toc240539010"/>
       <w:r>
@@ -53676,19 +53206,21 @@
         <w:rPr>
           <w:sz w:val="22"/>
         </w:rPr>
-        <w:t>Table 3.34  The Program Specification Table for Pyx Tracker: Web-based Enterprise Operations Management System.</w:t>
+        <w:t xml:space="preserve">Table </w:t>
       </w:r>
       <w:proofErr w:type="gramStart"/>
       <w:r>
         <w:rPr>
           <w:sz w:val="22"/>
         </w:rPr>
+        <w:t>3.34  The</w:t>
       </w:r>
       <w:proofErr w:type="gramEnd"/>
       <w:r>
         <w:rPr>
           <w:sz w:val="22"/>
         </w:rPr>
+        <w:t xml:space="preserve"> Program Specification Table for Pyx Tracker: Web-based Enterprise Operations Management System.</w:t>
       </w:r>
     </w:p>
     <w:tbl>
@@ -53702,10 +53234,11 @@
           <w:insideH w:val="single" w:sz="4" w:space="0" w:color="000000"/>
           <w:insideV w:val="single" w:sz="4" w:space="0" w:color="000000"/>
         </w:tblBorders>
+        <w:tblLook w:val="04A0" w:firstRow="1" w:lastRow="0" w:firstColumn="1" w:lastColumn="0" w:noHBand="0" w:noVBand="1"/>
       </w:tblPr>
       <w:tblGrid>
-        <w:gridCol w:w="4500"/>
-        <w:gridCol w:w="4500"/>
+        <w:gridCol w:w="4320"/>
+        <w:gridCol w:w="4310"/>
       </w:tblGrid>
       <w:tr>
         <w:tc>
@@ -53716,10 +53249,10 @@
             <w:r>
               <w:rPr>
                 <w:rFonts w:ascii="Times New Roman" w:hAnsi="Times New Roman"/>
+                <w:b/>
                 <w:sz w:val="22"/>
-                <w:b/>
-              </w:rPr>
-              <w:t xml:space="preserve">Language</w:t>
+              </w:rPr>
+              <w:t>Language</w:t>
             </w:r>
           </w:p>
         </w:tc>
@@ -53733,7 +53266,7 @@
                 <w:rFonts w:ascii="Times New Roman" w:hAnsi="Times New Roman"/>
                 <w:sz w:val="22"/>
               </w:rPr>
-              <w:t xml:space="preserve">PHP</w:t>
+              <w:t>PHP</w:t>
             </w:r>
           </w:p>
         </w:tc>
@@ -53747,10 +53280,10 @@
             <w:r>
               <w:rPr>
                 <w:rFonts w:ascii="Times New Roman" w:hAnsi="Times New Roman"/>
+                <w:b/>
                 <w:sz w:val="22"/>
-                <w:b/>
-              </w:rPr>
-              <w:t xml:space="preserve">Database</w:t>
+              </w:rPr>
+              <w:t>Database</w:t>
             </w:r>
           </w:p>
         </w:tc>
@@ -53764,7 +53297,7 @@
                 <w:rFonts w:ascii="Times New Roman" w:hAnsi="Times New Roman"/>
                 <w:sz w:val="22"/>
               </w:rPr>
-              <w:t xml:space="preserve">MySQL, XAMPP Server</w:t>
+              <w:t>MySQL, XAMPP Server</w:t>
             </w:r>
           </w:p>
         </w:tc>
@@ -53778,10 +53311,11 @@
     </w:p>
     <w:p>
       <w:pPr>
-        <w:pStyle w:val="Heading3"/>
+        <w:pStyle w:val="CapHeading3"/>
       </w:pPr>
       <w:bookmarkStart w:id="44" w:name="_Toc240539011"/>
       <w:r>
+        <w:lastRenderedPageBreak/>
         <w:t>Testing and Evaluation Procedure</w:t>
       </w:r>
       <w:bookmarkEnd w:id="44"/>
@@ -54337,8 +53871,11 @@
         <w:jc w:val="both"/>
       </w:pPr>
       <w:r>
+        <w:t xml:space="preserve">User evaluation should involve representatives of the actual operational roles performing defined tasks. Records should identify the selection method, </w:t>
+      </w:r>
+      <w:r>
         <w:lastRenderedPageBreak/>
-        <w:t>User evaluation should involve representatives of the actual operational roles performing defined tasks. Records should identify the selection method, number of participants, instrument, date, and system release. Any comparison of task time or stock accuracy must use comparable conditions and explain the measurements. No respondent count, rating, or improvement percentage is claimed without those records.</w:t>
+        <w:t>number of participants, instrument, date, and system release. Any comparison of task time or stock accuracy must use comparable conditions and explain the measurements. No respondent count, rating, or improvement percentage is claimed without those records.</w:t>
       </w:r>
     </w:p>
     <w:p>
@@ -54351,7 +53888,7 @@
     </w:p>
     <w:p>
       <w:pPr>
-        <w:pStyle w:val="Heading3"/>
+        <w:pStyle w:val="CapHeading3"/>
       </w:pPr>
       <w:bookmarkStart w:id="45" w:name="_Toc240539012"/>
       <w:r>
@@ -54882,6 +54419,45 @@
           </w:p>
         </w:tc>
       </w:tr>
+      <w:tr>
+        <w:trPr>
+          <w:jc w:val="center"/>
+        </w:trPr>
+        <w:tc>
+          <w:tcPr>
+            <w:tcW w:w="3096" w:type="dxa"/>
+          </w:tcPr>
+          <w:p>
+            <w:r>
+              <w:lastRenderedPageBreak/>
+              <w:t>Point of Sale System (Web and Mobile POS)</w:t>
+            </w:r>
+          </w:p>
+        </w:tc>
+        <w:tc>
+          <w:tcPr>
+            <w:tcW w:w="4752" w:type="dxa"/>
+          </w:tcPr>
+          <w:p>
+            <w:r>
+              <w:t xml:space="preserve">Web and Android Mobile POS </w:t>
+            </w:r>
+            <w:r>
+              <w:t>authentication, barcode sell and AR credit checkout, ESC/POS receipt printing, sales history, reprint, and full-sale refund synchronized to RTS inventory.</w:t>
+            </w:r>
+          </w:p>
+        </w:tc>
+        <w:tc>
+          <w:tcPr>
+            <w:tcW w:w="792" w:type="dxa"/>
+          </w:tcPr>
+          <w:p>
+            <w:r>
+              <w:t>6</w:t>
+            </w:r>
+          </w:p>
+        </w:tc>
+      </w:tr>
     </w:tbl>
     <w:p>
       <w:pPr>
@@ -54891,7 +54467,7 @@
     </w:p>
     <w:p>
       <w:pPr>
-        <w:pStyle w:val="Heading1"/>
+        <w:pStyle w:val="CapHeading1"/>
         <w:pageBreakBefore/>
         <w:jc w:val="center"/>
       </w:pPr>
@@ -58492,6 +58068,35 @@
       <w:sz w:val="22"/>
     </w:rPr>
   </w:style>
+  <w:style w:type="paragraph" w:customStyle="1" w:styleId="CapHeading1">
+    <w:name w:val="Cap Heading 1"/>
+    <w:basedOn w:val="Heading1"/>
+    <w:uiPriority w:val="9"/>
+    <w:qFormat/>
+    <w:pPr>
+      <w:outlineLvl w:val="9"/>
+    </w:pPr>
+  </w:style>
+  <w:style w:type="paragraph" w:customStyle="1" w:styleId="CapHeading2">
+    <w:name w:val="Cap Heading 2"/>
+    <w:basedOn w:val="Heading2"/>
+    <w:uiPriority w:val="9"/>
+    <w:unhideWhenUsed/>
+    <w:qFormat/>
+    <w:pPr>
+      <w:outlineLvl w:val="9"/>
+    </w:pPr>
+  </w:style>
+  <w:style w:type="paragraph" w:customStyle="1" w:styleId="CapHeading3">
+    <w:name w:val="Cap Heading 3"/>
+    <w:basedOn w:val="Heading3"/>
+    <w:uiPriority w:val="9"/>
+    <w:unhideWhenUsed/>
+    <w:qFormat/>
+    <w:pPr>
+      <w:outlineLvl w:val="9"/>
+    </w:pPr>
+  </w:style>
 </w:styles>
 </file>
 

</xml_diff>